<commit_message>
Export memo to PDF and DOCX
</commit_message>
<xml_diff>
--- a/output/memo.docx
+++ b/output/memo.docx
@@ -4,7 +4,7 @@
   <w:body>
     <w:p>
       <w:pPr>
-        <w:jc w:val="left"/>
+        <w:pStyle w:val="Heading1"/>
       </w:pPr>
       <w:r>
         <w:t>Transitioning to the AI-Native Biotech: Compounding 10x Operational Leverage in Clinical Development</w:t>
@@ -15,7 +15,13 @@
         <w:jc w:val="left"/>
       </w:pPr>
       <w:r>
-        <w:t>Author: Forward Deployed Engineering Task Force / Biotech Strategy Group</w:t>
+        <w:rPr>
+          <w:b/>
+        </w:rPr>
+        <w:t>Author:</w:t>
+      </w:r>
+      <w:r>
+        <w:t xml:space="preserve"> Tiger Huang, PLACEHOLDER, PLACEHOLDER, PLACEHOLDER</w:t>
       </w:r>
     </w:p>
     <w:p>
@@ -23,7 +29,13 @@
         <w:jc w:val="left"/>
       </w:pPr>
       <w:r>
-        <w:t>Date: May 2026</w:t>
+        <w:rPr>
+          <w:b/>
+        </w:rPr>
+        <w:t>Date:</w:t>
+      </w:r>
+      <w:r>
+        <w:t xml:space="preserve"> May 2026</w:t>
       </w:r>
     </w:p>
     <w:p>
@@ -31,7 +43,13 @@
         <w:jc w:val="left"/>
       </w:pPr>
       <w:r>
-        <w:t>Classification: Biotech Strategy Memo</w:t>
+        <w:rPr>
+          <w:b/>
+        </w:rPr>
+        <w:t>Classification:</w:t>
+      </w:r>
+      <w:r>
+        <w:t xml:space="preserve"> AI-Native Biotech Strategy</w:t>
       </w:r>
     </w:p>
     <w:p>
@@ -39,12 +57,18 @@
         <w:jc w:val="left"/>
       </w:pPr>
       <w:r>
-        <w:t>Audience: Biotechnology Executives, Clinical Operations Leaders, R&amp;D Portfolio Managers, Venture Capitalists</w:t>
+        <w:rPr>
+          <w:b/>
+        </w:rPr>
+        <w:t>Audience:</w:t>
+      </w:r>
+      <w:r>
+        <w:t xml:space="preserve"> Biotechnology Executives, AI Executives, Investors</w:t>
       </w:r>
     </w:p>
     <w:p>
       <w:pPr>
-        <w:jc w:val="left"/>
+        <w:pStyle w:val="Heading2"/>
       </w:pPr>
       <w:r>
         <w:t>Executive Summary</w:t>
@@ -55,7 +79,16 @@
         <w:jc w:val="left"/>
       </w:pPr>
       <w:r>
-        <w:t>The biotechnology sector in May 2026 stands at a critical inflection point. For over a decade, early-stage biotechnology platforms have relied on traditional statistical machine learning (ML) models to identify targets, optimize compound binding affinities, and screen vast in silico molecular libraries. While these computational target discovery engines have successfully populated preclinical pipelines with high-quality candidates, they have failed to resolve the industry's most expensive problem: clinical trial attrition.</w:t>
+        <w:t xml:space="preserve">This memo defines the strategic framework of the true </w:t>
+      </w:r>
+      <w:r>
+        <w:rPr>
+          <w:b/>
+        </w:rPr>
+        <w:t>AI-native biotech</w:t>
+      </w:r>
+      <w:r>
+        <w:t>—a lean, hyper-agile organization that goes beyond early-stage target math to re-engineer the entire operational biology of the company AI-first and from scratch. In an AI-native biotech, every employee is augmented by a network of goal-directed, autonomous AI agents acting as digital teammates to orchestrate trial protocols, parse patient records, automate regulatory submissions, and eliminate manual "white space" under human-in-the-loop oversight. By replacing legacy administrative handoffs with continuous agentic workflows, an AI-native biotech achieves a 10x operational productivity leap, enables leadership to make high-quality strategic decisions faster, and mitigates critical protocol compliance risks. Crucially, this operational acceleration allows the organization to identify, due diligence, and execute high-value licensing deals with unprecedented agility while systematically avoiding the costly operational and strategic missteps that account for 30% to 50% of drug candidate attrition in traditional, legacy biopharma.</w:t>
       </w:r>
     </w:p>
     <w:p>
@@ -63,7 +96,7 @@
         <w:jc w:val="left"/>
       </w:pPr>
       <w:r>
-        <w:t>The primary operational bottleneck of drug development is not target math; it is downstream clinical execution, specifically during high-stakes Phase 2 and Phase 3 trials. It is in this "clinical execution space"—where operational complexity, protocol design flaws, manual data-management bottlenecks, and administrative handoff delays reside—that over 90% of therapeutic assets fail, draining billions in capital and delaying life-saving therapies by years.</w:t>
+        <w:t>Importantly, this compounding operational leverage has immediate, high-leverage applications in global asset sourcing and cross-border licensing. In the wake of the massive Chinese outbound licensing boom (representing a record $135.7 billion in 2025), a three-person AI-native operational team can utilize a compounding Company Brain and screening agents to continuously crawl clinical registries, conduct rigorous data-integrity diligence, and license high-quality, de-risked clinical assets with 10x greater agility than bloated traditional conglomerates.</w:t>
       </w:r>
     </w:p>
     <w:p>
@@ -71,28 +104,12 @@
         <w:jc w:val="left"/>
       </w:pPr>
       <w:r>
-        <w:t>This memo defines the emergence of the true "AI-native biotech"—an organization that goes beyond early-stage target math to re-engineer the entire operational biology of the company. In an AI-native biotech, every employee, from the Chief Medical Officer to the clinical quality auditor, is augmented by a network of goal-directed, autonomous AI agents. These digital teammates proactively coordinate trial protocols, parse unstructured patient records, automate GxP-compliant regulatory filings, and eliminate manual "white space" with human-in-the-loop oversight.</w:t>
+        <w:t>Ultimately, this paradigm shift represents a once-in-a-lifetime opportunity to build a generational $100 billion to $1 trillion biopharma company. By operating with just 10% of the tier-1 human labor footprint of traditional biopharma and commanding a highly orchestrated swarm of autonomous agents, the AI-native biotech is positioned to run circles around slow-moving legacy organizations and capture unprecedented global market share.</w:t>
       </w:r>
     </w:p>
     <w:p>
       <w:pPr>
-        <w:jc w:val="left"/>
-      </w:pPr>
-      <w:r>
-        <w:t>By replacing legacy administrative handoffs with continuous agentic orchestration, an AI-native biotech compresses clinical trial timelines by 40% to 60%, eliminates critical protocol compliance risks, and achieves a 10x operational productivity leap across pivotal drug development roles.</w:t>
-      </w:r>
-    </w:p>
-    <w:p>
-      <w:pPr>
-        <w:jc w:val="left"/>
-      </w:pPr>
-      <w:r>
-        <w:t>Because biotechnology operations are entirely knowledge-based—defined by dense clinical protocols, extensive literature corpuses, massive databases, and highly structured regulatory filings—it is, after software development, the most natural sector to embrace autonomous agentic architectures. This document provides a detailed strategic framework for executives, clinical leaders, and investors to navigate and execute this operational transformation.</w:t>
-      </w:r>
-    </w:p>
-    <w:p>
-      <w:pPr>
-        <w:pStyle w:val="Heading1"/>
+        <w:pStyle w:val="Heading2"/>
       </w:pPr>
       <w:r>
         <w:t>1. Defining the AI-Native Biotech</w:t>
@@ -103,7 +120,7 @@
         <w:jc w:val="left"/>
       </w:pPr>
       <w:r>
-        <w:t>To fully capture the leverage of this paradigm shift, it is necessary to establish a clear distinction between the legacy "AI-enabled" discovery platform and the modern "AI-native" clinical developer.</w:t>
+        <w:t>The fundamental goal of the AI-native biotech is to design and build operational processes AI-first and from scratch, rather than attempting to retroactively shoehorn artificial intelligence into legacy clinical frameworks. By re-engineering the company's operational biology, a lean organization staffed by a small team of A-player operators augmented by autonomous agentic systems can achieve a 10x operational productivity leap. While established biopharma conglomerates will undoubtedly maintain their massive capital scale, the AI-native biotech counteracts this advantage with 10x greater operational agility, effectiveness, and execution efficiency—running circles around slow-moving legacy organizations.</w:t>
       </w:r>
     </w:p>
     <w:p>
@@ -111,7 +128,7 @@
         <w:jc w:val="left"/>
       </w:pPr>
       <w:r>
-        <w:t>Traditional ML in drug discovery is a highly successful and mature upstream paradigm. These platforms excel at processing structured molecular structures to predict binding affinities or optimize lead compounds. However, they are fundamentally static, isolated mathematical models designed to predict a single parameter. They do not reason, they do not manage operational workflows, and they do not address the clinical execution bottlenecks that govern whether a drug actually reaches a patient.</w:t>
+        <w:t>While the concept of the AI-native biotechnology company has gained rapid traction across academic research and peer-reviewed literature, it has yet to see major, public traction in the broader commercial industry. Most established biopharma companies remain anchored to legacy enterprise software and manual operating models, leaving a massive strategic vacuum for early adopters. A growing consensus of literature highlights the unique capabilities of goal-directed, autonomous clinical agents to coordinate complex clinical trials and automate operations. By synthesizing peer-reviewed frameworks and real-world operational benchmarks, we can establish the formal foundations of this paradigm shift.</w:t>
       </w:r>
     </w:p>
     <w:p>
@@ -119,7 +136,7 @@
         <w:jc w:val="left"/>
       </w:pPr>
       <w:r>
-        <w:t>Conversely, the AI-native biotech operates downstream of molecular design. An AI-native biotech is defined by the operational integration of networks of goal-directed, autonomous AI agents acting as digital teammates across the entire drug development lifecycle. Business operations are designed AI-first: rather than forcing AI into legacy software architectures, workflows are built to enable agents to proactively orchestrate tasks, parse unstructured patient records, reason through complex clinical protocols, and draft GxP-compliant filings with human oversight.</w:t>
+        <w:t>At its core, an AI-native biotech is defined by the operational integration of networks of goal-directed, autonomous AI agents acting as digital teammates across the entire drug development lifecycle. Unlike legacy developers, business operations here are designed AI-first: workflows are built to enable agents to proactively orchestrate tasks, parse unstructured patient records, reason through clinical protocols, and draft GxP-compliant regulatory filings under human oversight.</w:t>
       </w:r>
     </w:p>
     <w:p>
@@ -127,7 +144,15 @@
         <w:jc w:val="left"/>
       </w:pPr>
       <w:r>
-        <w:t>This operational reality is validated by a growing body of peer-reviewed scientific literature and practical platform implementations:</w:t>
+        <w:t>This approach is fundamentally distinct from traditional machine learning (ML) platforms that currently dominate upstream drug discovery. While traditional ML excels at predicting target binding affinities or optimizing molecular structures, these static, isolated models do not reason or address downstream clinical execution. The AI-native biotech picks up where upstream discovery ends, leveraging agentic systems to solve the downstream trial bottlenecks that govern whether a therapeutic asset actually reaches a patient.</w:t>
+      </w:r>
+    </w:p>
+    <w:p>
+      <w:pPr>
+        <w:pStyle w:val="Heading3"/>
+      </w:pPr>
+      <w:r>
+        <w:t>Research 1: ClinicalAgent — Outcomes and Timeline Prediction</w:t>
       </w:r>
     </w:p>
     <w:p>
@@ -139,29 +164,56 @@
           <w:b/>
           <w:i/>
         </w:rPr>
-        <w:t>Academic Consensus:</w:t>
+        <w:t>Profile:</w:t>
       </w:r>
       <w:r>
         <w:rPr>
           <w:i/>
         </w:rPr>
-        <w:t xml:space="preserve"> Autonomous, goal-directed agents extend beyond traditional ML and isolated LLMs by enabling autonomous actions across the clinical trial lifecycle. These systems have the potential to coordinate activities leveraging trial protocols and patient data, invoking tools dynamically, and interacting with multiple components of a clinical trial pipeline — mimicking roles such as coordinators or analysts.</w:t>
+        <w:t xml:space="preserve"> A multi-agent framework utilizing GPT-4 with Reasoning and Acting (ReAct) and Least-to-Most prompting structures to function as a virtual clinical team.</w:t>
       </w:r>
     </w:p>
     <w:p>
       <w:pPr>
-        <w:pStyle w:val="Quote"/>
-      </w:pPr>
+        <w:jc w:val="left"/>
+      </w:pPr>
+      <w:r>
+        <w:t xml:space="preserve">Developed by Yue et al. (2024), </w:t>
+      </w:r>
+      <w:r>
+        <w:rPr>
+          <w:b/>
+        </w:rPr>
+        <w:t>ClinicalAgent</w:t>
+      </w:r>
+      <w:r>
+        <w:t xml:space="preserve"> integrates patient data and historical trial metrics. It improved trial outcome and failure prediction by 0.33 AUC over baseline prompting methods, while dynamically predicting enrollment timelines and highlighting potential bottlenecks. (https://arxiv.org/abs/2404.14777)</w:t>
+      </w:r>
     </w:p>
     <w:p>
       <w:pPr>
+        <w:pStyle w:val="Heading3"/>
+      </w:pPr>
+      <w:r>
+        <w:t>Research 2: MAKAR — Eligibility Matching</w:t>
+      </w:r>
+    </w:p>
+    <w:p>
+      <w:pPr>
         <w:pStyle w:val="Quote"/>
       </w:pPr>
+      <w:r>
+        <w:rPr>
+          <w:b/>
+          <w:i/>
+        </w:rPr>
+        <w:t>Profile:</w:t>
+      </w:r>
       <w:r>
         <w:rPr>
           <w:i/>
         </w:rPr>
-        <w:t>Source: Badani, A., de Moraes, F.Y., Vollmuth, P., et al. "AI and innovation in clinical trials." npj Digit. Med. 8, 683 (2025). DOI: 10.1038/s41746-025-02048-5 (https://doi.org/10.1038/s41746-025-02048-5)</w:t>
+        <w:t xml:space="preserve"> A double-module multi-agent system designed to automate patient-trial eligibility matching with strict data privacy guarantees.</w:t>
       </w:r>
     </w:p>
     <w:p>
@@ -169,77 +221,85 @@
         <w:jc w:val="left"/>
       </w:pPr>
       <w:r>
-        <w:t>This theoretical capacity is realized in several validated agent frameworks:</w:t>
+        <w:t xml:space="preserve">Developed by Shi et al. (2024), </w:t>
       </w:r>
-    </w:p>
-    <w:p>
-      <w:pPr>
-        <w:pStyle w:val="ListBullet"/>
-      </w:pPr>
       <w:r>
         <w:rPr>
           <w:b/>
         </w:rPr>
-        <w:t>ClinicalAgent (arXiv:2404.14777):</w:t>
+        <w:t>MAKAR</w:t>
       </w:r>
       <w:r>
-        <w:t xml:space="preserve"> Developed by Yue et al. (2024), this multi-agent framework utilizes GPT-4 with Reasoning and Acting (ReAct) and Least-to-Most prompting structures to act as a virtual clinical team. By integrating external patient data and historical trial metrics, ClinicalAgent improved clinical trial outcome and failure prediction by 0.33 AUC over baseline prompting methods, while dynamically predicting enrollment timelines and highlighting enrollment bottlenecks. (https://arxiv.org/abs/2404.14777)</w:t>
+        <w:t xml:space="preserve"> utilizes an Augmentation Module to translate ambiguous inclusion/exclusion criteria into clear clinical concepts, and a Reasoning Module with Collaborator, Critique, and Navigator agents to match patient charts. It achieved an average F1-score improvement of 7% to 8% across clinical datasets and reached 100% accuracy in controlled matching tasks, executing locally to ensure patient data privacy. (https://arxiv.org/abs/2411.14637)</w:t>
       </w:r>
     </w:p>
     <w:p>
       <w:pPr>
-        <w:pStyle w:val="ListBullet"/>
-      </w:pPr>
+        <w:pStyle w:val="Heading3"/>
+      </w:pPr>
+      <w:r>
+        <w:t>Research 3: BioXconomy CRA Analysis — Risk-Based Monitoring</w:t>
+      </w:r>
+    </w:p>
+    <w:p>
+      <w:pPr>
+        <w:pStyle w:val="Quote"/>
+      </w:pPr>
+      <w:r>
+        <w:rPr>
+          <w:b/>
+          <w:i/>
+        </w:rPr>
+        <w:t>Profile:</w:t>
+      </w:r>
+      <w:r>
+        <w:rPr>
+          <w:i/>
+        </w:rPr>
+        <w:t xml:space="preserve"> An industry analysis demonstrating the efficiency of risk-based monitoring agents in handling routine verification and reporting.</w:t>
+      </w:r>
+    </w:p>
+    <w:p>
+      <w:pPr>
+        <w:jc w:val="left"/>
+      </w:pPr>
+      <w:r>
+        <w:t xml:space="preserve">The </w:t>
+      </w:r>
       <w:r>
         <w:rPr>
           <w:b/>
         </w:rPr>
-        <w:t>MAKAR (arXiv:2411.14637):</w:t>
+        <w:t>BioXconomy CRA Analysis</w:t>
       </w:r>
       <w:r>
-        <w:t xml:space="preserve"> A double-module multi-agent system developed by Shi et al. (2024) to automate patient-trial eligibility matching. An Augmentation Module translates ambiguous inclusion/exclusion criteria into clear clinical concepts, while a Reasoning Module uses specialized Collaborator, Critique, and Navigator agents to match patient charts. MAKAR achieved an average F1-score improvement of 7% to 8% across clinical datasets and reached 100% accuracy in controlled matching tasks, executing locally to ensure patient data privacy. (https://arxiv.org/abs/2411.14637)</w:t>
+        <w:t xml:space="preserve"> demonstrates that risk-based monitoring agents handle 80% of routine verification, site messaging, and monitoring report generation. This shifts human CRAs from travel-heavy administrative auditing to high-value medical oversight. (https://www.bioxconomy.com/clinical-and-research/how-ai-agents-are-transforming-the-clinical-trial-process-for-cras)</w:t>
       </w:r>
     </w:p>
     <w:p>
       <w:pPr>
-        <w:pStyle w:val="ListBullet"/>
+        <w:pStyle w:val="Heading3"/>
+      </w:pPr>
+      <w:r>
+        <w:t>Research 4: Human Oversight Dynamics</w:t>
+      </w:r>
+    </w:p>
+    <w:p>
+      <w:pPr>
+        <w:pStyle w:val="Quote"/>
       </w:pPr>
       <w:r>
         <w:rPr>
           <w:b/>
+          <w:i/>
         </w:rPr>
-        <w:t>Medable Agent Studio:</w:t>
+        <w:t>Definition:</w:t>
       </w:r>
       <w:r>
-        <w:t xml:space="preserve"> An enterprise platform that enables clinical operations teams to deploy pre-configured, GxP-compliant Clinical Research Associate (CRA) and electronic Trial Master File (eTMF) agents. These agents continuously audit data streams, automate document organization, and flag risk patterns in real time. (https://www.medable.com/platform/agent-studio)</w:t>
-      </w:r>
-    </w:p>
-    <w:p>
-      <w:pPr>
-        <w:pStyle w:val="ListBullet"/>
-      </w:pPr>
-      <w:r>
         <w:rPr>
-          <w:b/>
+          <w:i/>
         </w:rPr>
-        <w:t>BioXconomy CRA Analysis:</w:t>
-      </w:r>
-      <w:r>
-        <w:t xml:space="preserve"> An industry analysis demonstrating that risk-based monitoring agents handle 80% of routine verification, site messaging, and monitoring report generation, shifting human CRAs from travel-heavy administrative auditing to high-value medical oversight. (https://www.bioxconomy.com/clinical-and-research/how-ai-agents-are-transforming-the-clinical-trial-process-for-cras)</w:t>
-      </w:r>
-    </w:p>
-    <w:p>
-      <w:pPr>
-        <w:pStyle w:val="ListBullet"/>
-      </w:pPr>
-      <w:r>
-        <w:rPr>
-          <w:b/>
-        </w:rPr>
-        <w:t>Narrativa Clinical Atlas:</w:t>
-      </w:r>
-      <w:r>
-        <w:t xml:space="preserve"> A multi-agent clinical swarm comprising Protocol Design, Protocol Burden, and Protocol Auditor agents that automates ICH M11-compliant protocol design, compressing drafting times from 6–9 months to under 2 weeks. (https://www.narrativa.com/protocol-clinical-trials-automation-with-ai-agents)</w:t>
+        <w:t xml:space="preserve"> A structured operational framework governing the interaction between human clinical staff and autonomous AI agents to ensure safety and system stability.</w:t>
       </w:r>
     </w:p>
     <w:p>
@@ -252,10 +312,10 @@
     </w:p>
     <w:p>
       <w:pPr>
-        <w:pStyle w:val="Heading1"/>
+        <w:pStyle w:val="Heading2"/>
       </w:pPr>
       <w:r>
-        <w:t>2. 360 Adoption: The AI-First Operational Reality</w:t>
+        <w:t>2. 360 Degrees AI Adoption</w:t>
       </w:r>
     </w:p>
     <w:p>
@@ -263,7 +323,7 @@
         <w:jc w:val="left"/>
       </w:pPr>
       <w:r>
-        <w:t>In an AI-native biotech, agent integration is ubiquitous. Every team member—from the Chief Medical Officer to the clinical quality manager—works with and through autonomous AI agents.</w:t>
+        <w:t>In an AI-native biotech, agent integration is ubiquitous. Everyone—from the Chief Medical Officer to the clinical quality manager—works with and through autonomous AI agents.</w:t>
       </w:r>
     </w:p>
     <w:p>
@@ -271,7 +331,25 @@
         <w:jc w:val="left"/>
       </w:pPr>
       <w:r>
-        <w:t>To achieve this state in the current market, organizations must navigate a practical reality: the team must currently rely on software developer tools, including OpenCode, VSCode, and Hermes Agent. While these developer-centric interfaces can feel awkward for business operators, they represent the most mature, reasoning-dense agent cores available in the market. Rather than waiting for polished enterprise interfaces, the AI-native biotech embraces this awkwardness to secure a structural head start, while actively driving the development of business-friendly open-source equivalents.</w:t>
+        <w:t xml:space="preserve">To achieve this state in the current market, organizations must navigate a practical reality: clinical and business teams must rely on developer-centric tools like </w:t>
+      </w:r>
+      <w:r>
+        <w:rPr>
+          <w:b/>
+        </w:rPr>
+        <w:t>OpenCode</w:t>
+      </w:r>
+      <w:r>
+        <w:t xml:space="preserve"> or the </w:t>
+      </w:r>
+      <w:r>
+        <w:rPr>
+          <w:b/>
+        </w:rPr>
+        <w:t>Hermes Agent</w:t>
+      </w:r>
+      <w:r>
+        <w:t xml:space="preserve"> core. While these reasoning-dense frameworks can initially feel unfamiliar or awkward to clinical operators used to legacy enterprise software, they represent the most mature, high-reasoning agent cores available in the market today. Rather than waiting for polished, proprietary enterprise software, the AI-native biotech embraces this initial friction to secure an immediate, structural head start, while actively building business-friendly, model-agnostic, and open-source equivalents.</w:t>
       </w:r>
     </w:p>
     <w:p>
@@ -279,7 +357,43 @@
         <w:jc w:val="left"/>
       </w:pPr>
       <w:r>
-        <w:t>To maintain operational sovereignty and manage cost, the AI-native biotech operates under three core strategic imperatives:</w:t>
+        <w:t xml:space="preserve">To maintain operational sovereignty and manage cost, the AI-native biotech operates under four core strategic imperatives. First, it must deploy a </w:t>
+      </w:r>
+      <w:r>
+        <w:rPr>
+          <w:b/>
+        </w:rPr>
+        <w:t>model-agnostic infrastructure</w:t>
+      </w:r>
+      <w:r>
+        <w:t xml:space="preserve"> using a flexible orchestration layer to decouple the model layer from core workflows, maintaining absolute flexibility to swap providers as capabilities evolve. Second, it must practice </w:t>
+      </w:r>
+      <w:r>
+        <w:rPr>
+          <w:b/>
+        </w:rPr>
+        <w:t>active token cost management</w:t>
+      </w:r>
+      <w:r>
+        <w:t xml:space="preserve"> by routing simple data-mapping tasks to cost-effective local models and reserving frontier API models for complex reasoning. Third, it must mandate an </w:t>
+      </w:r>
+      <w:r>
+        <w:rPr>
+          <w:b/>
+        </w:rPr>
+        <w:t>open architecture</w:t>
+      </w:r>
+      <w:r>
+        <w:t xml:space="preserve"> that preserves clean boundaries between models and applications to resist vendor lock-in. Finally, it must initialize </w:t>
+      </w:r>
+      <w:r>
+        <w:rPr>
+          <w:b/>
+        </w:rPr>
+        <w:t>agent-friendly markdown workflows</w:t>
+      </w:r>
+      <w:r>
+        <w:t>, minimizing PowerPoint in favor of structured Markdown to enable seamless agentic ingestion and reasoning.</w:t>
       </w:r>
     </w:p>
     <w:p>
@@ -287,55 +401,23 @@
         <w:jc w:val="left"/>
       </w:pPr>
       <w:r>
-        <w:t>First, the setup must be model-agnostic to mitigate the shifting Pareto curve. Standardizing a single proprietary model vendor is economically indefensible, as the capability-to-cost frontier shifts quarterly. The organization must deploy a flexible orchestration layer built on open frameworks that can dynamically route, cache, and swap models based on cost and performance parameters without requiring infrastructure rewrites.</w:t>
+        <w:t>Achieving a complete, 360-degree adoption of AI requires integrating these digital teammates across every critical function, particularly as the company's gravity shifts from upstream target discovery to downstream clinical execution. Below, we outline how key clinical development roles adopt goal-directed, autonomous agents to drive this operational reality across every major organizational domain—compressing timelines, eliminating administrative friction, and securing 10x operational leverage:</w:t>
       </w:r>
     </w:p>
     <w:p>
       <w:pPr>
-        <w:jc w:val="left"/>
+        <w:pStyle w:val="Heading3"/>
       </w:pPr>
       <w:r>
-        <w:t>Second, the organization must implement active token cost management. This involves deploying tiered routing architectures that default simple reasoning tasks to highly cost-effective local or open-source models, while selectively routing complex, multi-step work to frontier models, optimized via semantic caching.</w:t>
+        <w:t>Domain 1: Clinical Development &amp; Biometrics</w:t>
       </w:r>
     </w:p>
     <w:p>
       <w:pPr>
-        <w:jc w:val="left"/>
+        <w:pStyle w:val="Heading3"/>
       </w:pPr>
       <w:r>
-        <w:t>Third, the organization must resist proprietary platform lock-in. Proprietary platform orchestration layers impose a high "abstraction tax" and carry dangerous operational lock-in risks. The AI-native biotech mandates an open architecture that preserves the clear boundary between the model layer and the application layer, ensuring absolute portability and enabling the company to retain full operational sovereignty over its custom AI systems and proprietary IP.</w:t>
-      </w:r>
-    </w:p>
-    <w:p>
-      <w:pPr>
-        <w:jc w:val="left"/>
-      </w:pPr>
-      <w:r>
-        <w:t>Finally, the organization must initialize agent-friendly workflows. Because AI agents operate with maximum fidelity when processing structured text, the organization must make an explicit operational pivot: minimizing PowerPoint slides and human-centric narrative-hiding formats. All strategic analyses, protocols, meeting memos, and design decisions are authored in Markdown. This allows agents to seamlessly ingest, link, reason over, and update the corporate knowledge corpus without human transcription friction.</w:t>
-      </w:r>
-    </w:p>
-    <w:p>
-      <w:pPr>
-        <w:pStyle w:val="Heading1"/>
-      </w:pPr>
-      <w:r>
-        <w:t>3. Phase 2/3 Pivotal Roles: The 10x Operational Reality</w:t>
-      </w:r>
-    </w:p>
-    <w:p>
-      <w:pPr>
-        <w:jc w:val="left"/>
-      </w:pPr>
-      <w:r>
-        <w:t>When a biotechnology company transitions its focus toward Phase 2 and Phase 3 trials, the entire organizational gravity shifts from research-focused discovery to clinical execution. The financial stakes skyrocket because Phase 3 trials are massive, global, and highly variable in cost.</w:t>
-      </w:r>
-    </w:p>
-    <w:p>
-      <w:pPr>
-        <w:jc w:val="left"/>
-      </w:pPr>
-      <w:r>
-        <w:t>The industry benchmark for navigating this high-stakes operational pivot is established by elite clinical operators who bridge the gap between science, finance, and operational execution:</w:t>
+        <w:t>Role 1: The Chief Medical Officer — Protocol Orchestration</w:t>
       </w:r>
     </w:p>
     <w:p>
@@ -347,29 +429,56 @@
           <w:b/>
           <w:i/>
         </w:rPr>
-        <w:t>Operator Profile:</w:t>
+        <w:t>Profile:</w:t>
       </w:r>
       <w:r>
         <w:rPr>
           <w:i/>
         </w:rPr>
-        <w:t xml:space="preserve"> Elite, technically fluent hybrid talent—such as Dr. Lara S. Sullivan—combines an M.D. (University of Pennsylvania) with an M.B.A. (Wharton) and deep financial and operational experience (McKinsey, Credit Suisse). Dr. Sullivan's signature achievements, including conceiving and executing the SpringWorks Therapeutics clinical spin-out from Pfizer (which went from a $103M Series A to a $3.9B acquisition by Merck KGaA in 2025) and leading Pyxis Oncology through a $152M Series B and $168M IPO to advance next-generation Antibody-Drug Conjugates (ADCs) like micvotabart pelidotin (MICVO/PYX-201) in head and neck squamous cell carcinoma, demonstrate the immense value of rigorous, multi-functional clinical leadership.</w:t>
+        <w:t xml:space="preserve"> Senior clinical strategist responsible for trial design and protocol development, augmented by multi-agent swarms to automate compliant designs.</w:t>
       </w:r>
     </w:p>
     <w:p>
       <w:pPr>
-        <w:pStyle w:val="Quote"/>
-      </w:pPr>
+        <w:jc w:val="left"/>
+      </w:pPr>
+      <w:r>
+        <w:t xml:space="preserve">The </w:t>
+      </w:r>
+      <w:r>
+        <w:rPr>
+          <w:b/>
+        </w:rPr>
+        <w:t>Chief Medical Officer (CMO)</w:t>
+      </w:r>
+      <w:r>
+        <w:t xml:space="preserve"> leverages clinical multi-agent swarms to automate ICH M11-compliant protocol design. Specialized Protocol Design, Protocol Burden, and Protocol Auditor agents check representativeness, evaluate patient burden, and audit designs against regulatory guidelines. This compresses protocol drafting timelines from 6–9 months to under 2 weeks—a 10x productivity leap—while lowering downstream protocol amendments by up to 80%.</w:t>
+      </w:r>
     </w:p>
     <w:p>
       <w:pPr>
+        <w:pStyle w:val="Heading3"/>
+      </w:pPr>
+      <w:r>
+        <w:t>Role 2: The Lead Biostatistician — Analytical Programming</w:t>
+      </w:r>
+    </w:p>
+    <w:p>
+      <w:pPr>
         <w:pStyle w:val="Quote"/>
       </w:pPr>
+      <w:r>
+        <w:rPr>
+          <w:b/>
+          <w:i/>
+        </w:rPr>
+        <w:t>Profile:</w:t>
+      </w:r>
       <w:r>
         <w:rPr>
           <w:i/>
         </w:rPr>
-        <w:t>Source: SEC EDGAR Filings, Pyxis Oncology (Feb 2026) (https://www.sec.gov/Archives/edgar/data/1782223/000119312526041169/pyxs-20260206.htm), Fierce Pharma (Apr 2025) (https://www.fiercepharma.com/pharma/merck-kgaa-acquires-pfizer-spinout-springworks-39b)</w:t>
+        <w:t xml:space="preserve"> Quantitative expert responsible for statistical powering and trial data analysis, utilizing automated double-programming pipelines.</w:t>
       </w:r>
     </w:p>
     <w:p>
@@ -377,187 +486,443 @@
         <w:jc w:val="left"/>
       </w:pPr>
       <w:r>
-        <w:t>To support this caliber of clinical leadership, an AI-native biotech reorganizes its operations around five functional pillars, deploying specialized agent networks to empower eleven pivotal roles and achieve a 10x productivity increase:</w:t>
+        <w:t xml:space="preserve">The </w:t>
       </w:r>
-    </w:p>
-    <w:p>
-      <w:pPr>
-        <w:pStyle w:val="Heading2"/>
-      </w:pPr>
-      <w:r>
-        <w:t>Clinical Development &amp; Biometrics</w:t>
-      </w:r>
-    </w:p>
-    <w:p>
-      <w:pPr>
-        <w:pStyle w:val="ListBullet"/>
-      </w:pPr>
       <w:r>
         <w:rPr>
           <w:b/>
         </w:rPr>
-        <w:t>Chief Medical Officer (CMO) / VP of Clinical Development:</w:t>
+        <w:t>Lead Biostatistician</w:t>
       </w:r>
       <w:r>
-        <w:t xml:space="preserve"> In a traditional model, the CMO spends months drafting the clinical protocol and Target Product Profile (TPP) while managing academic key opinion leaders (KOLs) and regulatory panels. In the AI-native model, the CMO leverages clinical multi-agent swarms (like Narrativa's Clinical Atlas) to automate ICH M11-compliant protocol design. Specialized Protocol Design, Protocol Burden, and Protocol Auditor agents work in parallel to check representativeness, evaluate patient burden, and audit designs against regulatory guidelines. This compresses protocol drafting timelines from 6–9 months to under 2 weeks, representing a 10x productivity increase, while lowering downstream protocol amendments by up to 80%.</w:t>
+        <w:t xml:space="preserve"> deploys multi-agent biostatistics programming pipelines. An autonomous SAP Architect Agent ingests raw EDC schemas to draft the statistical analysis plan (SAP), while parallel Code Generator and Audit agents automatically write GxP-compliant SAS/R scripts. The agents perform independent double-programming to mathematically verify results, completely eliminating manual coding backlogs and accelerating Table, Listing, and Figure (TLF) generation by 10x.</w:t>
       </w:r>
     </w:p>
     <w:p>
       <w:pPr>
-        <w:pStyle w:val="ListBullet"/>
-      </w:pPr>
+        <w:pStyle w:val="Heading3"/>
+      </w:pPr>
+      <w:r>
+        <w:t>Domain 2: Clinical Operations (ClinOps)</w:t>
+      </w:r>
+    </w:p>
+    <w:p>
+      <w:pPr>
+        <w:pStyle w:val="Heading3"/>
+      </w:pPr>
+      <w:r>
+        <w:t>Role 3: The Head of Clinical Operations — Trial Orchestration</w:t>
+      </w:r>
+    </w:p>
+    <w:p>
+      <w:pPr>
+        <w:pStyle w:val="Quote"/>
+      </w:pPr>
+      <w:r>
+        <w:rPr>
+          <w:b/>
+          <w:i/>
+        </w:rPr>
+        <w:t>Profile:</w:t>
+      </w:r>
+      <w:r>
+        <w:rPr>
+          <w:i/>
+        </w:rPr>
+        <w:t xml:space="preserve"> Operational leader managing global clinical trial sites, enrollment, and variable costs via agentic CTMS integrations.</w:t>
+      </w:r>
+    </w:p>
+    <w:p>
+      <w:pPr>
+        <w:jc w:val="left"/>
+      </w:pPr>
+      <w:r>
+        <w:t xml:space="preserve">The </w:t>
+      </w:r>
       <w:r>
         <w:rPr>
           <w:b/>
         </w:rPr>
-        <w:t>Lead Biostatistician:</w:t>
+        <w:t>Head of Clinical Operations</w:t>
       </w:r>
       <w:r>
-        <w:t xml:space="preserve"> Responsible for ensuring the trial is properly powered to prove statistical significance and managing interim readouts. The biostatistician deploys multi-agent biostatistics programming pipelines. An autonomous SAP Architect Agent ingests raw EDC schemas to draft the statistical analysis plan (SAP), while parallel Code Generator and Audit agents automatically write and run GxP-compliant SAS/R scripts. The agents perform independent double-programming to mathematically verify results, completely eliminating manual coding backlogs and accelerating the generation of interim Tables, Listings, and Figures (TLFs) by 10x.</w:t>
+        <w:t xml:space="preserve"> deploys autonomous ClinOps agents integrated directly with the Electronic Data Capture (EDC) and Clinical Trial Management System (CTMS). Using ReAct-based multi-agent frameworks (such as ClinicalAgent), the agents dynamically track global enrollment velocities and predict trial duration. Operational bottlenecks and protocol compliance risks are flagged before they cause multi-week delays, allowing the director to oversee 10x more sites and patients per FTE.</w:t>
       </w:r>
     </w:p>
     <w:p>
       <w:pPr>
-        <w:pStyle w:val="Heading2"/>
+        <w:pStyle w:val="Heading3"/>
       </w:pPr>
       <w:r>
-        <w:t>Clinical Operations (ClinOps)</w:t>
+        <w:t>Role 4: The CRO Management Lead — Vendor Governance</w:t>
       </w:r>
     </w:p>
     <w:p>
       <w:pPr>
-        <w:pStyle w:val="ListBullet"/>
-      </w:pPr>
+        <w:pStyle w:val="Quote"/>
+      </w:pPr>
+      <w:r>
+        <w:rPr>
+          <w:b/>
+          <w:i/>
+        </w:rPr>
+        <w:t>Profile:</w:t>
+      </w:r>
+      <w:r>
+        <w:rPr>
+          <w:i/>
+        </w:rPr>
+        <w:t xml:space="preserve"> Vendor manager governing Contract Research Organizations and monitoring budgets through autonomous billing audit agents.</w:t>
+      </w:r>
+    </w:p>
+    <w:p>
+      <w:pPr>
+        <w:jc w:val="left"/>
+      </w:pPr>
+      <w:r>
+        <w:t xml:space="preserve">The </w:t>
+      </w:r>
       <w:r>
         <w:rPr>
           <w:b/>
         </w:rPr>
-        <w:t>Head of Clinical Operations / Clinical Project Directors:</w:t>
+        <w:t>CRO Management Lead</w:t>
       </w:r>
       <w:r>
-        <w:t xml:space="preserve"> Oversees the scaling of trials across dozens of global sites, tracking enrollment and variable costs. They deploy autonomous ClinOps agents integrated directly with the EDC and CTMS. Using ReAct-based multi-agent frameworks (such as ClinicalAgent), the agents dynamically track global enrollment velocities, predict trial duration, and flag protocol compliance risks before they cause multi-week delays. This real-time oversight allows the director to oversee 10x more sites and patients per FTE.</w:t>
+        <w:t xml:space="preserve"> employs autonomous contract and billing audit agents. The agents continuously ingest weekly CRO status updates, matching them against patient records and CTMS logs to verify clinical milestones. Discrepancies, delayed data entry, or billing anomalies are flagged automatically, reducing manual verification by 10x and enabling a single lead to govern multiple global CRO vendors simultaneously with zero administrative overhead.</w:t>
       </w:r>
     </w:p>
     <w:p>
       <w:pPr>
-        <w:pStyle w:val="ListBullet"/>
-      </w:pPr>
+        <w:pStyle w:val="Heading3"/>
+      </w:pPr>
+      <w:r>
+        <w:t>Domain 3: CMC &amp; Supply Chain</w:t>
+      </w:r>
+    </w:p>
+    <w:p>
+      <w:pPr>
+        <w:pStyle w:val="Heading3"/>
+      </w:pPr>
+      <w:r>
+        <w:t>Role 5: The VP of CMC — Manufacturing Dossier Assembly</w:t>
+      </w:r>
+    </w:p>
+    <w:p>
+      <w:pPr>
+        <w:pStyle w:val="Quote"/>
+      </w:pPr>
+      <w:r>
+        <w:rPr>
+          <w:b/>
+          <w:i/>
+        </w:rPr>
+        <w:t>Profile:</w:t>
+      </w:r>
+      <w:r>
+        <w:rPr>
+          <w:i/>
+        </w:rPr>
+        <w:t xml:space="preserve"> Chemistry, Manufacturing, and Controls leader scaling batch production to GMP standards, augmented by real-time sensor audit agents.</w:t>
+      </w:r>
+    </w:p>
+    <w:p>
+      <w:pPr>
+        <w:jc w:val="left"/>
+      </w:pPr>
+      <w:r>
+        <w:t xml:space="preserve">The </w:t>
+      </w:r>
       <w:r>
         <w:rPr>
           <w:b/>
         </w:rPr>
-        <w:t>CRO Management Lead / Vendor Manager:</w:t>
+        <w:t>VP of CMC</w:t>
       </w:r>
       <w:r>
-        <w:t xml:space="preserve"> Governs the Contract Research Organizations (CROs) managing site monitors and clinical budgets. They employ autonomous contract and billing audit agents. The agents continuously ingest weekly CRO status updates, matching them against patient records and CTMS logs to verify clinical milestones. Discrepancies, delayed data entry, or billing anomalies are flagged automatically, reducing manual verification by 10x and enabling a single lead to govern multiple global CRO vendors simultaneously with zero administrative overhead.</w:t>
+        <w:t xml:space="preserve"> deploys CMC monitoring agents that ingest real-time Process Analytical Technology (PAT) sensor data and manufacturing run records. The agents automatically analyze stability profiles, identify chemical purity deviations, and draft Module 3 (Quality) of the Common Technical Document (CTD). By automating 90% of data extraction during tech transfer, the agent compiles compliance dossiers 10x faster with zero transcription errors.</w:t>
       </w:r>
     </w:p>
     <w:p>
       <w:pPr>
-        <w:pStyle w:val="Heading2"/>
+        <w:pStyle w:val="Heading3"/>
       </w:pPr>
       <w:r>
-        <w:t>Chemistry, Manufacturing, and Controls (CMC) &amp; Supply Chain</w:t>
+        <w:t>Role 6: The Clinical Supply Chain Manager — Inventory Simulation</w:t>
       </w:r>
     </w:p>
     <w:p>
       <w:pPr>
-        <w:pStyle w:val="ListBullet"/>
-      </w:pPr>
+        <w:pStyle w:val="Quote"/>
+      </w:pPr>
+      <w:r>
+        <w:rPr>
+          <w:b/>
+          <w:i/>
+        </w:rPr>
+        <w:t>Profile:</w:t>
+      </w:r>
+      <w:r>
+        <w:rPr>
+          <w:i/>
+        </w:rPr>
+        <w:t xml:space="preserve"> Logistics manager ensuring uninterrupted global clinical supply chain operations using demand-supply simulation agents.</w:t>
+      </w:r>
+    </w:p>
+    <w:p>
+      <w:pPr>
+        <w:jc w:val="left"/>
+      </w:pPr>
+      <w:r>
+        <w:t xml:space="preserve">The </w:t>
+      </w:r>
       <w:r>
         <w:rPr>
           <w:b/>
         </w:rPr>
-        <w:t>VP of CMC / Process Development Lead:</w:t>
+        <w:t>Clinical Supply Chain Manager</w:t>
       </w:r>
       <w:r>
-        <w:t xml:space="preserve"> Responsible for shifting production from bench batches to commercial-scale Good Manufacturing Practice (GMP) validation. They deploy CMC monitoring agents that ingest real-time Process Analytical Technology (PAT) sensor data and manufacturing run records. The agents automatically analyze stability profiles, identify chemical purity deviations, and draft Module 3 (Quality) of the Common Technical Document (CTD). By automating 90% of data extraction during tech transfer, the agent compiles compliance dossiers 10x faster with zero transcription errors.</w:t>
+        <w:t xml:space="preserve"> utilizes intelligent inventory planning agents connected to the Interactive Response Technology (IRT/RTSM). The agents run real-time demand-supply simulations, analyzing enrollment rates, shipping durations, and cold-chain temperature logs. Replenishment orders are dynamically calculated and queued to prevent patient stockouts while reducing drug waste by over 50%, resulting in a 10x planning efficiency gain.</w:t>
       </w:r>
     </w:p>
     <w:p>
       <w:pPr>
-        <w:pStyle w:val="ListBullet"/>
-      </w:pPr>
+        <w:pStyle w:val="Heading3"/>
+      </w:pPr>
+      <w:r>
+        <w:t>Domain 4: Regulatory Affairs &amp; Quality Assurance (QA/QC)</w:t>
+      </w:r>
+    </w:p>
+    <w:p>
+      <w:pPr>
+        <w:pStyle w:val="Heading3"/>
+      </w:pPr>
+      <w:r>
+        <w:t>Role 7: The VP of Regulatory Affairs — Submission Swarm Orchestration</w:t>
+      </w:r>
+    </w:p>
+    <w:p>
+      <w:pPr>
+        <w:pStyle w:val="Quote"/>
+      </w:pPr>
+      <w:r>
+        <w:rPr>
+          <w:b/>
+          <w:i/>
+        </w:rPr>
+        <w:t>Profile:</w:t>
+      </w:r>
+      <w:r>
+        <w:rPr>
+          <w:i/>
+        </w:rPr>
+        <w:t xml:space="preserve"> Regulatory lead driving the NDA/BLA dossier assembly via automated multi-agent drafting and auditing swarms.</w:t>
+      </w:r>
+    </w:p>
+    <w:p>
+      <w:pPr>
+        <w:jc w:val="left"/>
+      </w:pPr>
+      <w:r>
+        <w:t xml:space="preserve">The </w:t>
+      </w:r>
       <w:r>
         <w:rPr>
           <w:b/>
         </w:rPr>
-        <w:t>Clinical Supply Chain Manager:</w:t>
+        <w:t>VP of Regulatory Affairs</w:t>
       </w:r>
       <w:r>
-        <w:t xml:space="preserve"> Manages cold-chain global logistics to ensure clinical sites have uninterrupted supplies of drugs and placebos. They utilize intelligent inventory planning agents connected to the Interactive Response Technology (IRT/RTSM). The agents run real-time demand-supply simulations, analyzing enrollment rates, shipping durations, and cold-chain temperature logs. Replenishment orders are dynamically calculated and queued to prevent patient stockouts while reducing drug waste by over 50%, resulting in a 10x planning efficiency gain.</w:t>
+        <w:t xml:space="preserve"> orchestrates a multi-agent regulatory submission swarm. Specialized drafting agents ingest raw preclinical and clinical dossiers to generate Module 2 (Summaries) and Module 5 (Clinical Study Reports) of the CTD. In parallel, a dedicated Auditor Agent cross-references every drafted clinical claim directly back to source SAS tables. This compresses the timeline for NDA/BLA dossier assembly from several months to under two weeks, achieving a 10x productivity leap.</w:t>
       </w:r>
     </w:p>
     <w:p>
       <w:pPr>
-        <w:pStyle w:val="Heading2"/>
+        <w:pStyle w:val="Heading3"/>
       </w:pPr>
       <w:r>
-        <w:t>Regulatory Affairs &amp; Quality Assurance (QA/QC)</w:t>
+        <w:t>Role 8: The Head of Clinical Quality — Inspection Readiness Auditing</w:t>
       </w:r>
     </w:p>
     <w:p>
       <w:pPr>
-        <w:pStyle w:val="ListBullet"/>
-      </w:pPr>
+        <w:pStyle w:val="Quote"/>
+      </w:pPr>
+      <w:r>
+        <w:rPr>
+          <w:b/>
+          <w:i/>
+        </w:rPr>
+        <w:t>Profile:</w:t>
+      </w:r>
+      <w:r>
+        <w:rPr>
+          <w:i/>
+        </w:rPr>
+        <w:t xml:space="preserve"> Quality assurance lead ensuring GCP compliance through continuous eTMF and EDC background auditing agents.</w:t>
+      </w:r>
+    </w:p>
+    <w:p>
+      <w:pPr>
+        <w:jc w:val="left"/>
+      </w:pPr>
+      <w:r>
+        <w:t xml:space="preserve">The </w:t>
+      </w:r>
       <w:r>
         <w:rPr>
           <w:b/>
         </w:rPr>
-        <w:t>VP of Regulatory Affairs:</w:t>
+        <w:t>Head of Clinical Quality</w:t>
       </w:r>
       <w:r>
-        <w:t xml:space="preserve"> Leads the strategy for the New Drug Application (NDA) or Biologics License Application (BLA). They orchestrate a multi-agent regulatory submission swarm. Specialized drafting agents ingest raw preclinical and clinical dossiers to generate Module 2 (Summaries) and Module 5 (Clinical Study Reports) of the CTD. In parallel, a dedicated Auditor Agent cross-references every drafted clinical claim and data point directly back to source SAS tables and raw clinical databases. This compresses the timeline for NDA/BLA dossier assembly from several months to under two weeks, achieving a 10x productivity leap.</w:t>
+        <w:t xml:space="preserve"> deploys continuous inspection-readiness agents. The agents run persistent background audits across the electronic Trial Master File (eTMF) and EDC, automatically classifying documents against the DIA TMF Reference Model and identifying incomplete signatures or missing files. This shifts GCP compliance from high-stress quarterly audits to a continuous, real-time readiness model, reducing inspection preparation workloads by 10x.</w:t>
       </w:r>
     </w:p>
     <w:p>
       <w:pPr>
-        <w:pStyle w:val="ListBullet"/>
-      </w:pPr>
+        <w:pStyle w:val="Heading3"/>
+      </w:pPr>
+      <w:r>
+        <w:t>Domain 5: Commercial Readiness &amp; Market Access</w:t>
+      </w:r>
+    </w:p>
+    <w:p>
+      <w:pPr>
+        <w:pStyle w:val="Heading3"/>
+      </w:pPr>
+      <w:r>
+        <w:t>Role 9: The Chief Commercial Officer — Launch Readiness</w:t>
+      </w:r>
+    </w:p>
+    <w:p>
+      <w:pPr>
+        <w:pStyle w:val="Quote"/>
+      </w:pPr>
+      <w:r>
+        <w:rPr>
+          <w:b/>
+          <w:i/>
+        </w:rPr>
+        <w:t>Profile:</w:t>
+      </w:r>
+      <w:r>
+        <w:rPr>
+          <w:i/>
+        </w:rPr>
+        <w:t xml:space="preserve"> Commercial leader mapping competitive landscapes and GTM strategies using crawling and medical communication agents.</w:t>
+      </w:r>
+    </w:p>
+    <w:p>
+      <w:pPr>
+        <w:jc w:val="left"/>
+      </w:pPr>
+      <w:r>
+        <w:t xml:space="preserve">The </w:t>
+      </w:r>
       <w:r>
         <w:rPr>
           <w:b/>
         </w:rPr>
-        <w:t>Head of Clinical Quality &amp; Inspection Readiness:</w:t>
+        <w:t>Chief Commercial Officer (CCO)</w:t>
       </w:r>
       <w:r>
-        <w:t xml:space="preserve"> Ensures absolute adherence to Good Clinical Practice (GCP). They deploy continuous inspection-readiness agents (such as Medable's eTMF and CRA Agents). The agents run persistent background audits across the electronic Trial Master File (eTMF) and EDC, automatically classifying documents against the DIA TMF Reference Model and identifying incomplete signatures, missing files, or logical discrepancies. This shifts GCP compliance from high-stress quarterly audits to a continuous, real-time readiness model, reducing inspection preparation workloads by 10x.</w:t>
+        <w:t xml:space="preserve"> utilizes competitive intelligence and medical communications agents. The agents continuously crawl trial registries, conference abstracts, and medical literature to map the changing competitive landscape. Marketing agents automatically translate clinical trial data into compliant draft medical communications, scientific slide decks, and educational materials, accelerating commercial launch readiness and custom content preparation by 10x.</w:t>
       </w:r>
     </w:p>
     <w:p>
       <w:pPr>
-        <w:pStyle w:val="Heading2"/>
+        <w:pStyle w:val="Heading3"/>
       </w:pPr>
       <w:r>
-        <w:t>Commercial Readiness &amp; Market Access</w:t>
+        <w:t>Role 10: The Market Access Director — HEOR Synthesis</w:t>
       </w:r>
     </w:p>
     <w:p>
       <w:pPr>
-        <w:pStyle w:val="ListBullet"/>
-      </w:pPr>
+        <w:pStyle w:val="Quote"/>
+      </w:pPr>
+      <w:r>
+        <w:rPr>
+          <w:b/>
+          <w:i/>
+        </w:rPr>
+        <w:t>Profile:</w:t>
+      </w:r>
+      <w:r>
+        <w:rPr>
+          <w:i/>
+        </w:rPr>
+        <w:t xml:space="preserve"> HEOR specialist demonstrating clinical cost-effectiveness and running automated pricing simulations for global payers.</w:t>
+      </w:r>
+    </w:p>
+    <w:p>
+      <w:pPr>
+        <w:jc w:val="left"/>
+      </w:pPr>
+      <w:r>
+        <w:t xml:space="preserve">The </w:t>
+      </w:r>
       <w:r>
         <w:rPr>
           <w:b/>
         </w:rPr>
-        <w:t>Chief Commercial Officer (CCO) / Head of Marketing:</w:t>
+        <w:t>Market Access &amp; HEOR Director</w:t>
       </w:r>
       <w:r>
-        <w:t xml:space="preserve"> Maps the competitive landscape and designs the GTM framework. They utilize competitive intelligence and medical communications agents. The agents continuously crawl trial registries, conference abstracts, and medical literature to map the changing competitive landscape. Marketing agents automatically translate complex clinical trial data into compliant draft medical communications, scientific slide decks, and educational materials, accelerating commercial launch readiness and custom content preparation by 10x.</w:t>
+        <w:t xml:space="preserve"> leverages HEOR synthesis agents that ingest clinical efficacy metrics, real-world evidence (RWE), and patient-reported outcomes to automatically generate health economic dossiers. The agents run extensive Monte Carlo simulations to test pricing strategies against global reimbursement frameworks, reducing modeling cycle times by 10x and allowing the director to customize value dossiers for multiple payers concurrently.</w:t>
       </w:r>
     </w:p>
     <w:p>
       <w:pPr>
-        <w:pStyle w:val="ListBullet"/>
-      </w:pPr>
+        <w:pStyle w:val="Heading3"/>
+      </w:pPr>
+      <w:r>
+        <w:t>Domain 6: Capital Strategy</w:t>
+      </w:r>
+    </w:p>
+    <w:p>
+      <w:pPr>
+        <w:pStyle w:val="Heading3"/>
+      </w:pPr>
+      <w:r>
+        <w:t>Role 11: The CFO — Capital Strategy and Cash Burn Simulation</w:t>
+      </w:r>
+    </w:p>
+    <w:p>
+      <w:pPr>
+        <w:pStyle w:val="Quote"/>
+      </w:pPr>
+      <w:r>
+        <w:rPr>
+          <w:b/>
+          <w:i/>
+        </w:rPr>
+        <w:t>Profile:</w:t>
+      </w:r>
+      <w:r>
+        <w:rPr>
+          <w:i/>
+        </w:rPr>
+        <w:t xml:space="preserve"> Financial strategist balancing fixed operating costs against clinical trial variables using automated Monte Carlo forecasting.</w:t>
+      </w:r>
+    </w:p>
+    <w:p>
+      <w:pPr>
+        <w:jc w:val="left"/>
+      </w:pPr>
+      <w:r>
+        <w:t xml:space="preserve">The </w:t>
+      </w:r>
       <w:r>
         <w:rPr>
           <w:b/>
         </w:rPr>
-        <w:t>Market Access &amp; HEOR (Health Economics and Outcomes Research) Director:</w:t>
+        <w:t>CFO</w:t>
       </w:r>
       <w:r>
-        <w:t xml:space="preserve"> Develops data models showing cost-effectiveness compared to the standard of care. They leverage HEOR synthesis agents that ingest clinical efficacy metrics, real-world evidence (RWE), and patient-reported outcomes to automatically generate health economic dossiers and budget impact models. The agents run extensive Monte Carlo simulations to test pricing strategies against global reimbursement frameworks, reducing modeling cycle times by 10x and allowing the director to customize value dossiers for multiple payers concurrently.</w:t>
+        <w:t xml:space="preserve"> implements automated financial forecasting networks. The agents continuously ingest patient recruitment speeds, CMC process validation costs, and variable CRO invoices to execute live Monte Carlo cash burn simulations. By dynamically forecasting runway under various enrollment scenarios and drafting milestone-driven fundraising proposals, the CFO achieves a 10x speedup in capital planning cycles, ensuring proactive, risk-mitigated financial management.</w:t>
       </w:r>
     </w:p>
     <w:p>
@@ -565,29 +930,7 @@
         <w:pStyle w:val="Heading2"/>
       </w:pPr>
       <w:r>
-        <w:t>Capital Strategy</w:t>
-      </w:r>
-    </w:p>
-    <w:p>
-      <w:pPr>
-        <w:pStyle w:val="ListBullet"/>
-      </w:pPr>
-      <w:r>
-        <w:rPr>
-          <w:b/>
-        </w:rPr>
-        <w:t>CFO / Capital Strategy:</w:t>
-      </w:r>
-      <w:r>
-        <w:t xml:space="preserve"> Balances fixed operational costs against highly volatile, site-by-site clinical variables. They implement automated financial forecasting networks. The agents continuously ingest patient recruitment speeds, CMC process validation costs, and variable CRO invoices to execute live Monte Carlo cash burn simulations. By dynamically forecasting runway under various enrollment scenarios and drafting milestone-driven fundraising proposals, the CFO achieves a 10x speedup in capital planning cycles, ensuring proactive, risk-mitigated financial management.</w:t>
-      </w:r>
-    </w:p>
-    <w:p>
-      <w:pPr>
-        <w:pStyle w:val="Heading1"/>
-      </w:pPr>
-      <w:r>
-        <w:t>4. Decision Support: Technical Mitigation of Human Bias</w:t>
+        <w:t>3. Decision Support: Technical Mitigation of Human Bias</w:t>
       </w:r>
     </w:p>
     <w:p>
@@ -606,10 +949,10 @@
         <w:rPr>
           <w:b/>
         </w:rPr>
-        <w:t>Confirmation Bias (57% prevalence):</w:t>
+        <w:t>Confirmation Bias (57% prevalence)</w:t>
       </w:r>
       <w:r>
-        <w:t xml:space="preserve"> Designing trials to confirm hypotheses, selecting favorable endpoints, and ignoring contradictory evidence. (https://sdg.com/publications/mitigating-biases-in-pharmaceutical-rd-decision-making)</w:t>
+        <w:t>: Designing trials to confirm hypotheses, selecting favorable endpoints, and ignoring contradictory evidence. (https://sdg.com/publications/mitigating-biases-in-pharmaceutical-rd-decision-making)</w:t>
       </w:r>
     </w:p>
     <w:p>
@@ -620,10 +963,10 @@
         <w:rPr>
           <w:b/>
         </w:rPr>
-        <w:t>Champion Bias:</w:t>
+        <w:t>Champion Bias</w:t>
       </w:r>
       <w:r>
-        <w:t xml:space="preserve"> Evaluating a plan or proposal based on the track record of the person presenting it, or overweighing a senior champion's personal view.</w:t>
+        <w:t>: Evaluating a plan or proposal based on the track record of the person presenting it, or overweighing a senior champion's personal view.</w:t>
       </w:r>
     </w:p>
     <w:p>
@@ -634,10 +977,10 @@
         <w:rPr>
           <w:b/>
         </w:rPr>
-        <w:t>Sunk-Cost Fallacy:</w:t>
+        <w:t>Sunk-Cost Fallacy</w:t>
       </w:r>
       <w:r>
-        <w:t xml:space="preserve"> Continuing failing clinical programs due to cumulative historical spending. (https://www.drugpatentwatch.com/blog/decision-making-product-portfolios-pharmaceutical-research-development-managing-streams-innovation-highly-regulated-markets)</w:t>
+        <w:t>: Continuing failing clinical programs due to cumulative historical spending rather than future probability of success. (https://www.drugpatentwatch.com/blog/decision-making-product-portfolios-pharmaceutical-research-development-managing-streams-innovation-highly-regulated-markets)</w:t>
       </w:r>
     </w:p>
     <w:p>
@@ -648,10 +991,10 @@
         <w:rPr>
           <w:b/>
         </w:rPr>
-        <w:t>Groupthink &amp; Consensus Bias:</w:t>
+        <w:t>Groupthink and Consensus Bias</w:t>
       </w:r>
       <w:r>
-        <w:t xml:space="preserve"> Governance committees converging on consensus, suppressing critical dissent.</w:t>
+        <w:t>: Governance committees converging on premature consensus, actively suppressing critical dissent and minority opinions, as corroborated by Bieske et al. in Drug Discovery Today. (https://www.alacrita.com/blog/the-hidden-pitfalls-of-unconscious-bias-in-drug-development)</w:t>
       </w:r>
     </w:p>
     <w:p>
@@ -659,7 +1002,7 @@
         <w:jc w:val="left"/>
       </w:pPr>
       <w:r>
-        <w:t>These findings were corroborated by a 2023 follow-up study by Bieske et al. in Drug Discovery Today, which surveyed 92 portfolio managers and uncovered additional systemic biases, including fear to challenge authorities, fear of failure, and fear of risking career. (https://www.alacrita.com/blog/the-hidden-pitfalls-of-unconscious-bias-in-drug-development)</w:t>
+        <w:t>To operationalize mitigations, the AI-native biotech deploys disinterested, non-incentivized program reviewing agents. These agents ingest and synthesize a volume of context that far exceeds human limits—including thousands of clinical trials, RWE datasets, regulatory precedents, and safety alerts. By cross-referencing disparate databases in real time, agents detect hidden, horizontal correlations (such as systemic safety signals across mechanistically unrelated trials, CMC anomalies, or shifts in regulatory precedents) that would remain siloed to human teams. Furthermore, agents continuously evaluate trial data against target product profiles (TPPs), alerting teams immediately of deviations and acting as disinterested "No-Go" advocates who face no career risk for recommending termination.</w:t>
       </w:r>
     </w:p>
     <w:p>
@@ -667,15 +1010,15 @@
         <w:jc w:val="left"/>
       </w:pPr>
       <w:r>
-        <w:t>To operationalize mitigations, the AI-native biotech deploys specialized AI agents to act as disinterested, non-incentivized program reviewers. These agents can ingest and synthesize a volume of context that far exceeds human cognitive limits—including thousands of clinical trials, RWE datasets, regulatory precedent guidelines, and safety alerts.</w:t>
+        <w:t>The key operational mechanism for this bias mitigation is remarkably straightforward. While the human brain is highly susceptible to cognitive fatigue and recency bias—consistently over-indexing on the most recently read study, the most dramatic competitor press release, or the loudest voice in a committee room—autonomous AI agents operate without fatigue or emotional attachment. An agentic system can simultaneously consume, synthesize, and objectively weigh data across 10 to 20 recent clinical studies, historical trials, and regulatory precedents in active memory. By presenting a statistically grounded, comprehensive evidence base that does not favor any single recent outcome, these agents counteract the recency bias and emotional anchoring that so frequently lead human clinical boards to make disastrous Go/No-Go decisions.</w:t>
       </w:r>
     </w:p>
     <w:p>
       <w:pPr>
-        <w:jc w:val="left"/>
+        <w:pStyle w:val="Heading2"/>
       </w:pPr>
       <w:r>
-        <w:t>By cross-referencing disparate databases in real time, agents detect hidden, horizontal correlations (such as systemic safety signals across mechanistically unrelated trials, CMC manufacturing anomalies, or shifts in regulatory precedents) that would otherwise remain siloed and invisible to human teams. Furthermore, agents continuously evaluate trial data against precommitted, quantifiable target product profiles (TPPs), alerting teams immediately of deviations rather than waiting for formal stage-gate reviews.</w:t>
+        <w:t>4. Synthetic KOL: Virtual Advisory Panels</w:t>
       </w:r>
     </w:p>
     <w:p>
@@ -683,103 +1026,42 @@
         <w:jc w:val="left"/>
       </w:pPr>
       <w:r>
-        <w:t>To actively counteract these cognitive biases, the AI-native biotech deploys advanced agentic and multi-agent frameworks:</w:t>
+        <w:t>Key Opinion Leaders (KOLs), global regulatory authorities, and healthcare payers represent the critical external stakeholders whose validation determines a therapeutic asset's regulatory and commercial success. However, engaging human experts, regulators, and insurance payers is exceptionally slow, expensive, and constrained by organizational mindshare—with standard KOL advisory rates ranging from $400 to $600 per hour, and regulatory feedback taking months to secure.</w:t>
       </w:r>
     </w:p>
     <w:p>
       <w:pPr>
-        <w:pStyle w:val="Heading2"/>
+        <w:jc w:val="left"/>
       </w:pPr>
       <w:r>
-        <w:t>Multi-Agent Debate (MAD)</w:t>
+        <w:t xml:space="preserve">To resolve this bottleneck, the AI-native biotech instantiates virtual advisory panels that represent these distinct, hard-to-reach personas. By translating the publications, patents, clinical trial registries, and public statements of global experts, regulatory guidelines (e.g., FDA/EMA guidance documents), and historical insurance coverage decisions into customized agent personas, the organization can simulate multi-stakeholder advisory boards at will. This includes simulating not only synthetic </w:t>
       </w:r>
-    </w:p>
-    <w:p>
-      <w:pPr>
-        <w:jc w:val="left"/>
-      </w:pPr>
       <w:r>
-        <w:t>To overcome Degeneration-of-Thought (DoT)—the machine equivalent of confirmation bias where an isolated model gains confidence in its initial incorrect hypothesis during self-reflection—the organization implements the Multi-Agent Debate (MAD) framework (Liang et al., EMNLP 2024). By orchestrating a structured debate between adversarial agents, overseen by a neutral judge agent, the system forces the consideration of counterfactuals and dissenting evidence, breaking cognitive rigidity. (https://arxiv.org/abs/2305.19118)</w:t>
+        <w:rPr>
+          <w:b/>
+        </w:rPr>
+        <w:t>Key Opinion Leaders</w:t>
       </w:r>
-    </w:p>
-    <w:p>
-      <w:pPr>
-        <w:pStyle w:val="Heading2"/>
-      </w:pPr>
       <w:r>
-        <w:t>Sycophancy Mitigation &amp; Productive Disagreement</w:t>
+        <w:t xml:space="preserve"> to evaluate scientific merit, but also virtual </w:t>
       </w:r>
-    </w:p>
-    <w:p>
-      <w:pPr>
-        <w:jc w:val="left"/>
-      </w:pPr>
       <w:r>
-        <w:t>Multi-agent systems are vulnerable to inter-agent sycophancy, where models prioritize consensus over objective truth, leading to disagreement collapse (groupthink). Research shows that the optimal multi-agent architecture requires a carefully balanced pool of virtual personas (Yao et al., AWS/UW-Madison 2025). The organization intentionally deploys "Troublemaker" agents prompted to maintain independent, adversarial positions and challenge peer assertions, ensuring that critical safety or efficacy gaps are thoroughly interrogated. (https://arxiv.org/abs/2509.23055)</w:t>
+        <w:rPr>
+          <w:b/>
+        </w:rPr>
+        <w:t>regulatory auditors</w:t>
       </w:r>
-    </w:p>
-    <w:p>
-      <w:pPr>
-        <w:pStyle w:val="Heading2"/>
-      </w:pPr>
       <w:r>
-        <w:t>CONSENSAGENT</w:t>
+        <w:t xml:space="preserve"> to stress-test filing dossiers for compliance gaps, and synthetic </w:t>
       </w:r>
-    </w:p>
-    <w:p>
-      <w:pPr>
-        <w:jc w:val="left"/>
-      </w:pPr>
       <w:r>
-        <w:t>To optimize communication overhead and compute costs during multi-agent debates, the organization deploys the CONSENSAGENT framework (Pitre et al., ACL 2025). This framework models multi-agent deliberation as an optimization task, dynamically refining agent prompts in real-time based on inter-agent exchanges. This actively suppresses sycophancy, enabling the system to reach high-quality, unbiased consensus with significantly fewer debate rounds. (https://doi.org/10.18653/v1/2025.findings-acl.1141)</w:t>
+        <w:rPr>
+          <w:b/>
+        </w:rPr>
+        <w:t>healthcare payers</w:t>
       </w:r>
-    </w:p>
-    <w:p>
-      <w:pPr>
-        <w:pStyle w:val="Heading2"/>
-      </w:pPr>
       <w:r>
-        <w:t>MoLaCE (Mixture of Latent Concept Experts)</w:t>
-      </w:r>
-    </w:p>
-    <w:p>
-      <w:pPr>
-        <w:jc w:val="left"/>
-      </w:pPr>
-      <w:r>
-        <w:t>To achieve the benefits of debiasing within a single model at a fraction of the compute cost, the organization utilizes MoLaCE (Yao et al., 2024/2025). MoLaCE is a training-free framework that identifies latent conceptual directions within a single LLM's internal representations that correspond to input confirmation bias. It instantiates virtual "experts" by applying varying activation strengths along these latent directions and mixes their predictions at inference time, preventing the agent from simply rubber-stamping an executive's preferred hypothesis. (https://arxiv.org/abs/2412.02324)</w:t>
-      </w:r>
-    </w:p>
-    <w:p>
-      <w:pPr>
-        <w:pStyle w:val="Heading2"/>
-      </w:pPr>
-      <w:r>
-        <w:t>Trial Pathfinder</w:t>
-      </w:r>
-    </w:p>
-    <w:p>
-      <w:pPr>
-        <w:jc w:val="left"/>
-      </w:pPr>
-      <w:r>
-        <w:t>To address optimism bias and historical heuristics in trial design, which lead to overly restrictive exclusion criteria and systemic selection bias, the organization deploys Trial Pathfinder (Liu et al., Nature 2021). By analyzing real-world EHR data, Trial Pathfinder systematically simulates trials and optimizes eligibility criteria. When applied to advanced oncology trials, Trial Pathfinder safely doubled the pool of eligible patients, substantially increasing demographic representation while maintaining trial safety and efficacy endpoints. (https://doi.org/10.1038/s41586-021-03430-5)</w:t>
-      </w:r>
-    </w:p>
-    <w:p>
-      <w:pPr>
-        <w:pStyle w:val="Heading1"/>
-      </w:pPr>
-      <w:r>
-        <w:t>5. Synthetic KOL: Virtual Advisory Panels</w:t>
-      </w:r>
-    </w:p>
-    <w:p>
-      <w:pPr>
-        <w:jc w:val="left"/>
-      </w:pPr>
-      <w:r>
-        <w:t>Key Opinion Leaders (KOLs) represent the academic and clinical authority that validates a drug's commercial and scientific positioning. Engaging human KOLs is exceptionally slow and expensive, often costing $400 to $600 per hour for in-depth interviews.</w:t>
+        <w:t xml:space="preserve"> to critique pricing and reimbursement frameworks long before formal submission.</w:t>
       </w:r>
     </w:p>
     <w:p>
@@ -806,10 +1088,10 @@
         <w:rPr>
           <w:b/>
         </w:rPr>
-        <w:t>Commercial Metrics:</w:t>
+        <w:t>Commercial Cost Reduction</w:t>
       </w:r>
       <w:r>
-        <w:t xml:space="preserve"> While traditional human focus groups cost $15,000 to $30,000 per session, platforms like Delve AI can generate synthetic panels at a cost of approximately $0.99 to $2.00 per synthetic user. (https://www.delve.ai/blog/synthetic-panels)</w:t>
+        <w:t>: Platforms like Delve AI can generate synthetic panels at a cost of approximately $0.99 to $2.00 per synthetic user, compared to traditional focus groups that cost $15,000 to $30,000 per session. (https://www.delve.ai/blog/synthetic-panels)</w:t>
       </w:r>
     </w:p>
     <w:p>
@@ -820,10 +1102,10 @@
         <w:rPr>
           <w:b/>
         </w:rPr>
-        <w:t>Velocity of Insight:</w:t>
+        <w:t>Velocity of Insight</w:t>
       </w:r>
       <w:r>
-        <w:t xml:space="preserve"> The primary value is not the direct cost savings, but the speed of feedback. Having a representative, synthetic panel of global experts immediately accessible allows the strategy team to stress-test commercial positioning, pre-test scientific messaging, and critique clinical protocols in minutes rather than weeks.</w:t>
+        <w:t>: Having a representative, synthetic panel of global experts immediately accessible allows the strategy team to stress-test commercial positioning, pre-test scientific messaging, and critique clinical protocols in minutes rather than weeks.</w:t>
       </w:r>
     </w:p>
     <w:p>
@@ -831,23 +1113,7 @@
         <w:jc w:val="left"/>
       </w:pPr>
       <w:r>
-        <w:t>However, deploying synthetic KOL panels introduces critical risks that must be managed.</w:t>
-      </w:r>
-    </w:p>
-    <w:p>
-      <w:pPr>
-        <w:jc w:val="left"/>
-      </w:pPr>
-      <w:r>
-        <w:t>First, LLMs tend toward consensus, which can suppress highly novel, eccentric, or contrarian insights—what researchers call the "novelty suppression" or "missing 23%" problem, where an LLM hybrid recovered 77% of themes but missed the critical 23% of highly specific, non-obvious human insights. (https://sloanreview.mit.edu/article/gain-consumer-insight-with-generative-ai/)</w:t>
-      </w:r>
-    </w:p>
-    <w:p>
-      <w:pPr>
-        <w:jc w:val="left"/>
-      </w:pPr>
-      <w:r>
-        <w:t>Second, the organization must avoid the "Researcher as Demiurge" problem, where a researcher who constructs both the synthetic respondent and the AI moderator runs the risk of conducting a conversation with a sophisticated echo of their own assumptions, leading to comforting but incorrect conclusions.</w:t>
+        <w:t>However, deploying synthetic KOL panels introduces critical risks. LLMs tend toward consensus, which can suppress highly novel, eccentric, or contrarian insights—the "novelty suppression" or "missing 23%" problem, where an LLM hybrid recovered 77% of themes but missed the critical 23% of highly specific, non-obvious human insights. (https://sloanreview.mit.edu/article/gain-consumer-insight-with-generative-ai/) Furthermore, organizations must avoid the "Researcher as Demiurge" problem, where a researcher who constructs both the synthetic respondent and the AI moderator runs the risk of conducting a conversation with a sophisticated echo of their own assumptions, leading to comforting but incorrect conclusions.</w:t>
       </w:r>
     </w:p>
     <w:p>
@@ -869,10 +1135,10 @@
     </w:p>
     <w:p>
       <w:pPr>
-        <w:pStyle w:val="Heading1"/>
+        <w:pStyle w:val="Heading2"/>
       </w:pPr>
       <w:r>
-        <w:t>6. Company Brain: Compounding Organizational Intelligence</w:t>
+        <w:t>5. Company Brain: Compounding Organizational Intelligence</w:t>
       </w:r>
     </w:p>
     <w:p>
@@ -880,7 +1146,7 @@
         <w:jc w:val="left"/>
       </w:pPr>
       <w:r>
-        <w:t>Y Combinator's Summer 2026 Request for Startups (RFS) explicitly highlights the "Company Brain" as the missing layer between raw corporate data and reliable AI automation. It represents the living, structured map of how a company works, turning fragmented files into executable skills for agents. (https://www.ycombinator.com/rfs)</w:t>
+        <w:t>In a traditional biotechnology organization, critical knowledge is siloed across thousands of clinical protocols, scientific papers, meeting transcripts, and vendor invoices. Standard search or basic enterprise RAG (Retrieval-Augmented Generation) systems parse these documents from scratch on every query, leading to high latency, repetitive computational costs, and zero long-term accumulation of corporate intelligence.</w:t>
       </w:r>
     </w:p>
     <w:p>
@@ -888,7 +1154,25 @@
         <w:jc w:val="left"/>
       </w:pPr>
       <w:r>
-        <w:t>Most traditional Retrieval-Augmented Generation (RAG) systems retrieve raw chunks of document data dynamically at query time, forcing the LLM to re-evaluate, synthesize, and resolve contradictions from scratch on every single prompt. This approach leads to repetitive computation and no accumulation of structured knowledge.</w:t>
+        <w:t xml:space="preserve">To solve this, the AI-native biotech implements a persistent, compounding </w:t>
+      </w:r>
+      <w:r>
+        <w:rPr>
+          <w:b/>
+        </w:rPr>
+        <w:t>Company Brain</w:t>
+      </w:r>
+      <w:r>
+        <w:t xml:space="preserve"> structured around Andrej Karpathy's </w:t>
+      </w:r>
+      <w:r>
+        <w:rPr>
+          <w:b/>
+        </w:rPr>
+        <w:t>LLM Wiki</w:t>
+      </w:r>
+      <w:r>
+        <w:t xml:space="preserve"> paradigm. Rather than treating document processing as a series of isolated, ephemeral tasks, the LLM Wiki functions as a living codebase of corporate knowledge. When new information is introduced, autonomous agents compile, reconcile, and integrate it once, updating a persistent, interconnected web of markdown concept pages and resolving contradictions.</w:t>
       </w:r>
     </w:p>
     <w:p>
@@ -896,15 +1180,7 @@
         <w:jc w:val="left"/>
       </w:pPr>
       <w:r>
-        <w:t>The AI-native biotech addresses this by implementing Andrej Karpathy's "LLM Wiki" paradigm. Under this paradigm, the LLM Wiki is a persistent, compounding artifact. The LLM agent acts as the programmer, and the knowledge base behaves as the codebase. When a new source is introduced, the LLM compiles and integrates it once, resolving contradictions and updating relevant concept pages, ensuring the knowledge is always structured and pre-compiled. (https://gist.github.com/karpathy/442a6bf555914893e9891c11519de94f)</w:t>
-      </w:r>
-    </w:p>
-    <w:p>
-      <w:pPr>
-        <w:jc w:val="left"/>
-      </w:pPr>
-      <w:r>
-        <w:t>The operational architecture of the Company Brain consists of three distinct layers:</w:t>
+        <w:t>This architecture is organized into a robust three-layer system:</w:t>
       </w:r>
     </w:p>
     <w:p>
@@ -918,10 +1194,10 @@
         <w:rPr>
           <w:b/>
         </w:rPr>
-        <w:t>Raw Sources (Immutable):</w:t>
+        <w:t>Raw Sources (Immutable)</w:t>
       </w:r>
       <w:r>
-        <w:t xml:space="preserve"> The curated raw repository of truth, including scientific papers, clinical protocols, trial registries, and meeting transcripts. The LLM reads from these but never alters them.</w:t>
+        <w:t>: The foundational repository of primary source documents, including clinical protocols, academic literature, competitive trial registries, and CRO invoices.</w:t>
       </w:r>
     </w:p>
     <w:p>
@@ -935,10 +1211,10 @@
         <w:rPr>
           <w:b/>
         </w:rPr>
-        <w:t>The Wiki (Persistent Markdown):</w:t>
+        <w:t>The Wiki (Persistent Markdown)</w:t>
       </w:r>
       <w:r>
-        <w:t xml:space="preserve"> A structured directory of LLM-generated and maintained markdown files, including summaries, concept maps, entity profiles, and comparisons. The LLM entirely owns the write and edit operations of this directory.</w:t>
+        <w:t>: A highly structured, agent-maintained directory of concept maps, molecule profiles, manufacturing process dossiers, and operational guidelines.</w:t>
       </w:r>
     </w:p>
     <w:p>
@@ -952,10 +1228,10 @@
         <w:rPr>
           <w:b/>
         </w:rPr>
-        <w:t>The Schema (Rules &amp; Metacognition):</w:t>
+        <w:t>The Schema (Rules and Metacognition)</w:t>
       </w:r>
       <w:r>
-        <w:t xml:space="preserve"> A central configuration file (such as AGENTS.md) defining the boundaries, directory structures, and ingestion standards.</w:t>
+        <w:t>: A central configuration file (conceptually aligned with `AGENTS.md`) that explicitly defines directories, formatting standards, and ingestion boundaries for autonomous agents.</w:t>
       </w:r>
     </w:p>
     <w:p>
@@ -963,7 +1239,15 @@
         <w:jc w:val="left"/>
       </w:pPr>
       <w:r>
-        <w:t>To maintain the Company Brain, the agent executes three core workflows:</w:t>
+        <w:t>This technical architecture is validated by Y Combinator's Summer 2026 Request for Startups (RFS), which highlights the "Company Brain" as the critical, missing layer between raw corporate data and reliable agentic automation (https://www.ycombinator.com/rfs).</w:t>
+      </w:r>
+    </w:p>
+    <w:p>
+      <w:pPr>
+        <w:jc w:val="left"/>
+      </w:pPr>
+      <w:r>
+        <w:t>In day-to-day business operations, the LLM Wiki operates through three core automated workflows:</w:t>
       </w:r>
     </w:p>
     <w:p>
@@ -974,10 +1258,10 @@
         <w:rPr>
           <w:b/>
         </w:rPr>
-        <w:t>Ingest:</w:t>
+        <w:t>Source Ingestion</w:t>
       </w:r>
       <w:r>
-        <w:t xml:space="preserve"> Dropping a new raw source triggers the agent to read the source, generate a dedicated summary page, update the main index, and update 10 to 15 related concept or entity pages across the wiki to maintain cross-tool cohesion.</w:t>
+        <w:t>: When a team member uploads a raw document, agents analyze the content, automatically update the central catalog index, and immediately propagate relevant insights across 10 to 15 interconnected concept pages.</w:t>
       </w:r>
     </w:p>
     <w:p>
@@ -988,10 +1272,10 @@
         <w:rPr>
           <w:b/>
         </w:rPr>
-        <w:t>Query:</w:t>
+        <w:t>Synthesis and Retrieval</w:t>
       </w:r>
       <w:r>
-        <w:t xml:space="preserve"> The agent reads a highly structured index catalog to locate highly relevant pages and synthesize answers with exact citations, eliminating fragile real-time embeddings.</w:t>
+        <w:t>: Instead of querying raw database tables or running unstructured keyword searches, operators query the structured Wiki index to instantly retrieve comprehensive, expert-level strategic briefs with every claim directly cited back to immutable raw sources.</w:t>
       </w:r>
     </w:p>
     <w:p>
@@ -1002,10 +1286,10 @@
         <w:rPr>
           <w:b/>
         </w:rPr>
-        <w:t>Lint:</w:t>
+        <w:t>Continuous Auditing (Linting)</w:t>
       </w:r>
       <w:r>
-        <w:t xml:space="preserve"> The agent executes periodic background audits to flag contradictions between old and new data, identify knowledge gaps, and repair broken cross-references.</w:t>
+        <w:t>: Autonomous agentic pipelines run persistent background audits to detect logical contradictions between old and new files (such as a protocol amendment that contradicts a manufacturing dossier), identify knowledge gaps, and automatically repair broken cross-references.</w:t>
       </w:r>
     </w:p>
     <w:p>
@@ -1013,35 +1297,49 @@
         <w:jc w:val="left"/>
       </w:pPr>
       <w:r>
-        <w:t>This system relies on two critical system files to facilitate scale and navigation:</w:t>
+        <w:t xml:space="preserve">Furthermore, the LLM Wiki is entirely language-agnostic, enabling a global clinical operations team to operate seamlessly across borders with perfect translation and synchronization. Crucially, the Company Brain represents a fundamental evolution beyond passive, static enterprise storage systems such as Confluence or SharePoint. By ingesting not just static reference documents but also active meeting memos, trial dashboards, strategic board discussions, and clinical stage-gate decisions, it functions as a centralized, dynamic </w:t>
       </w:r>
-    </w:p>
-    <w:p>
-      <w:pPr>
-        <w:pStyle w:val="ListBullet"/>
-      </w:pPr>
       <w:r>
         <w:rPr>
           <w:b/>
         </w:rPr>
-        <w:t>index.md (Content Directory):</w:t>
+        <w:t>AI Chief of Staff</w:t>
       </w:r>
       <w:r>
-        <w:t xml:space="preserve"> A comprehensive, categorized catalog of all wiki pages containing links and one-line summaries, enabling the agent to map the entire knowledge corpus without needing complex vector database infrastructure.</w:t>
+        <w:t xml:space="preserve"> that sits at the center of the organization. This system possesses a continuous, synthesized understanding of the company's real-time operational status, acting as a proactive partner in guiding executive decision-making.</w:t>
       </w:r>
     </w:p>
     <w:p>
       <w:pPr>
-        <w:pStyle w:val="ListBullet"/>
-      </w:pPr>
+        <w:jc w:val="left"/>
+      </w:pPr>
+      <w:r>
+        <w:t>By establishing the LLM Wiki as the primary operational repository, the cost of keeping organizational knowledge current drops to near zero, enabling a hyper-efficient global clinical team to operate with absolute alignment and total context.</w:t>
+      </w:r>
+    </w:p>
+    <w:p>
+      <w:pPr>
+        <w:pStyle w:val="Heading2"/>
+      </w:pPr>
+      <w:r>
+        <w:t>6. Innovation Arbitrage: Global Asset Sourcing and Licensing Risks</w:t>
+      </w:r>
+    </w:p>
+    <w:p>
+      <w:pPr>
+        <w:jc w:val="left"/>
+      </w:pPr>
+      <w:r>
+        <w:t xml:space="preserve">The 10x operational productivity and cognitive augmentation described throughout this memo are not merely theoretical efficiency gains—they have immediate, high-leverage applications in global asset sourcing and licensing. Specifically, they unlock the ability to exploit the massive </w:t>
+      </w:r>
       <w:r>
         <w:rPr>
           <w:b/>
         </w:rPr>
-        <w:t>log.md (Chronological Log):</w:t>
+        <w:t>Innovation Arbitrage</w:t>
       </w:r>
       <w:r>
-        <w:t xml:space="preserve"> An append-only, chronologically sorted journal of all operations (e.g., `## [2026-05-21] ingest | Source Title`), allowing terminal tools like grep to quickly track history and current state.</w:t>
+        <w:t xml:space="preserve"> currently emerging from China.</w:t>
       </w:r>
     </w:p>
     <w:p>
@@ -1049,23 +1347,7 @@
         <w:jc w:val="left"/>
       </w:pPr>
       <w:r>
-        <w:t>By delegating the manual cost of bookkeeping (updating links, reconciling details, maintaining indexes) to LLM agents, the cost of keeping organizational knowledge current drops to near zero. A smaller, hyper-efficient clinical team operates with total, unified context, capable of querying the Company Brain about any drug candidate or competitive update and receiving a highly synthesized response directly cited to specific meeting memos and trial registries.</w:t>
-      </w:r>
-    </w:p>
-    <w:p>
-      <w:pPr>
-        <w:pStyle w:val="Heading1"/>
-      </w:pPr>
-      <w:r>
-        <w:t>7. Innovation Arbitrage: Global Asset Sourcing and Licensing Risks</w:t>
-      </w:r>
-    </w:p>
-    <w:p>
-      <w:pPr>
-        <w:jc w:val="left"/>
-      </w:pPr>
-      <w:r>
-        <w:t xml:space="preserve">In 2025, a fundamental transformation occurred in the global pharmaceutical market: Chinese biotechs underwent a dramatic shift from licensing Western drugs in to licensing Chinese-origin drugs out. In 2025, Chinese companies signed a record </w:t>
+        <w:t xml:space="preserve">In 2025, a fundamental transformation occurred in the global pharmaceutical market: Chinese biotechs underwent a dramatic shift from licensing Western drugs in to licensing Chinese-origin drugs out. Chinese companies signed a record </w:t>
       </w:r>
       <w:r>
         <w:rPr>
@@ -1083,7 +1365,15 @@
         <w:t>one-third of all global licensing spend</w:t>
       </w:r>
       <w:r>
-        <w:t>, and making China the world's most important source of licensable drug assets. (https://www.axios.com/2025/09/08/china-deals-biotech-us)</w:t>
+        <w:t>, and making China the world's most important source of licensable drug assets (https://www.axios.com/2025/09/08/china-deals-biotech-us).</w:t>
+      </w:r>
+    </w:p>
+    <w:p>
+      <w:pPr>
+        <w:jc w:val="left"/>
+      </w:pPr>
+      <w:r>
+        <w:t>For legacy pharmaceutical giants, aggressively sourcing from this massive influx of Chinese-origin clinical assets is an operational impossibility. Bloated manual processes, language barriers, complex cross-border regulations, and historical data-integrity risks limit their capacity to review and diligence more than a handful of candidate compounds per year. Conversely, a hyper-agile, AI-native biotech team—armed with a compounding Company Brain and autonomous screening agents—can continuously crawl Chinese clinical registries, ingest thousands of preclinical profiles, and conduct rigorous, automated due diligence at scale. This allows a three-person operational team to evaluate hundreds of assets, identify high-potential candidates, and execute cross-border licensing deals with 10x greater agility, speed, and strategic precision than a traditional biopharma conglomerate.</w:t>
       </w:r>
     </w:p>
     <w:p>
@@ -1128,19 +1418,24 @@
         <w:rPr>
           <w:b/>
         </w:rPr>
-        <w:t>CARVYKTI (ciltacabtagene autoleucel):</w:t>
+        <w:t>CARVYKTI (ciltacabtagene autoleucel)</w:t>
       </w:r>
       <w:r>
-        <w:t xml:space="preserve"> A Chinese-origin CAR-T cell therapy for multiple myeloma developed by Legend Biotech and licensed to J&amp;J. It became the first Chinese-origin CAR-T to receive FDA approval, generating </w:t>
+        <w:t>: First Chinese-origin CAR-T cell therapy to receive FDA approval, licensed to Johnson &amp; Johnson and generating $1+ billion in revenue.</w:t>
       </w:r>
+    </w:p>
+    <w:p>
+      <w:pPr>
+        <w:pStyle w:val="ListBullet"/>
+      </w:pPr>
       <w:r>
         <w:rPr>
           <w:b/>
         </w:rPr>
-        <w:t>$1+ billion</w:t>
+        <w:t>Tislelizumab</w:t>
       </w:r>
       <w:r>
-        <w:t xml:space="preserve"> in revenue in its first full year on the market and validating the global licensing model.</w:t>
+        <w:t>: A Chinese-origin PD-1 inhibitor developed by BeiGene, licensed to Novartis in a landmark $2.2 billion deal and receiving FDA approval in 2023.</w:t>
       </w:r>
     </w:p>
     <w:p>
@@ -1151,47 +1446,24 @@
         <w:rPr>
           <w:b/>
         </w:rPr>
-        <w:t>Tislelizumab:</w:t>
+        <w:t>Ivonescimab (AK112)</w:t>
       </w:r>
       <w:r>
-        <w:t xml:space="preserve"> A PD-1 inhibitor developed by BeiGene and licensed to Novartis in a landmark 2021 deal for </w:t>
+        <w:t>: A PD-1/VEGF bispecific antibody developed by Akeso, licensed to Summit Therapeutics in a $5.0 billion deal, demonstrating superior Phase 3 efficacy versus Keytruda.</w:t>
       </w:r>
+    </w:p>
+    <w:p>
+      <w:pPr>
+        <w:pStyle w:val="ListBullet"/>
+      </w:pPr>
       <w:r>
         <w:rPr>
           <w:b/>
         </w:rPr>
-        <w:t>$2.2 billion</w:t>
+        <w:t>GSK / Hengrui Deal</w:t>
       </w:r>
       <w:r>
-        <w:t>, receiving FDA approval in 2023.</w:t>
-      </w:r>
-    </w:p>
-    <w:p>
-      <w:pPr>
-        <w:pStyle w:val="ListBullet"/>
-      </w:pPr>
-      <w:r>
-        <w:rPr>
-          <w:b/>
-        </w:rPr>
-        <w:t>Ivonescimab (AK112):</w:t>
-      </w:r>
-      <w:r>
-        <w:t xml:space="preserve"> A PD-1/VEGF bispecific antibody developed by Akeso and licensed to Summit Therapeutics in a $5.0 billion deal, showing superior Phase 3 efficacy versus Keytruda.</w:t>
-      </w:r>
-    </w:p>
-    <w:p>
-      <w:pPr>
-        <w:pStyle w:val="ListBullet"/>
-      </w:pPr>
-      <w:r>
-        <w:rPr>
-          <w:b/>
-        </w:rPr>
-        <w:t>GSK / Hengrui Deal:</w:t>
-      </w:r>
-      <w:r>
-        <w:t xml:space="preserve"> A $12.5 billion outbound licensing deal for Hengrui's HRS-9821 for COPD, reflecting Hengrui's selective, premium pricing strategy. (https://visionlifesciences.com/insights/china-biotech-outbound-licensing-tracker)</w:t>
+        <w:t>: A $12.5 billion outbound licensing deal for Hengrui's HRS-9821 for COPD, reflecting premium, selective pricing. (https://visionlifesciences.com/insights/china-biotech-outbound-licensing-tracker)</w:t>
       </w:r>
     </w:p>
     <w:p>
@@ -1208,15 +1480,7 @@
         <w:t>Data Integrity</w:t>
       </w:r>
       <w:r>
-        <w:t>.</w:t>
-      </w:r>
-    </w:p>
-    <w:p>
-      <w:pPr>
-        <w:jc w:val="left"/>
-      </w:pPr>
-      <w:r>
-        <w:t xml:space="preserve">In July 2015, the Chinese FDA ordered a self-examination of clinical trial data behind 1,622 drug applications. This resulted in approximately </w:t>
+        <w:t xml:space="preserve">. In July 2015, the Chinese FDA ordered a self-examination of clinical trial data behind 1,622 drug applications. This resulted in approximately </w:t>
       </w:r>
       <w:r>
         <w:rPr>
@@ -1225,15 +1489,7 @@
         <w:t>80% of applications being voluntarily withdrawn</w:t>
       </w:r>
       <w:r>
-        <w:t xml:space="preserve"> due to serious quality issues, including data fabrication, GCP non-compliance, and incomplete data. (https://www.bmj.com/content/355/bmj.i5396) This shadow side was highlighted historically by the 2007 execution of SFDA head Zheng Xiaoyu for accepting bribes to approve untested medicines. (https://www.pharmaceutical-technology.com/features/featuretackling-false-trial-data-in-china-5691656)</w:t>
-      </w:r>
-    </w:p>
-    <w:p>
-      <w:pPr>
-        <w:jc w:val="left"/>
-      </w:pPr>
-      <w:r>
-        <w:t>While China's clinical trial quality has improved dramatically since 2015—driven by China's 2017 ICH membership, NMPA modernization, and partnerships with global CROs (IQVIA, Parexel)—ongoing data integrity concerns remain a real risk, as highlighted by the FDA's 2025 General Correspondence Letters to two Chinese testing firms. (https://www.fda.gov/news-events/press-announcements/fda-takes-action-address-data-integrity-concerns-two-chinese-third-party-testing-firms)</w:t>
+        <w:t xml:space="preserve"> due to serious quality issues, including data fabrication, GCP non-compliance, and incomplete data. (https://www.bmj.com/content/355/bmj.i5396) Tackle of false trial data has modernised rapidly, driven by China's 2017 ICH membership and partnerships with global CROs (IQVIA, Parexel). However, data integrity concerns remain a real risk, as highlighted by the FDA's 2025 General Correspondence Letters to two Chinese testing firms. (https://www.fda.gov/news-events/press-announcements/fda-takes-action-address-data-integrity-concerns-two-chinese-third-party-testing-firms)</w:t>
       </w:r>
     </w:p>
     <w:p>
@@ -1255,10 +1511,10 @@
         <w:rPr>
           <w:b/>
         </w:rPr>
-        <w:t>Toothless Anti-Shelving Clauses:</w:t>
+        <w:t>Toothless Anti-Shelving Clauses</w:t>
       </w:r>
       <w:r>
-        <w:t xml:space="preserve"> MNCs often prioritize competing internal pipelines. Innovators must demand specific, measurable development milestones and hard deadlines rather than relying on vague Commercially Reasonable Efforts (CRE) clauses. (https://www.morganlewis.com/pubs/2026/04/a-strategic-playbook-for-chinese-biotech-cross-border-deals-navigating-the-new-value-paradigm)</w:t>
+        <w:t>: MNCs prioritizing competing internal pipelines, leaving the licensed asset shelved. Innovators must demand specific, measurable development milestones and hard deadlines rather than relying on vague Commercially Reasonable Efforts (CRE) clauses. (https://www.morganlewis.com/pubs/2026/04/a-strategic-playbook-for-chinese-biotech-cross-border-deals-navigating-the-new-value-paradigm)</w:t>
       </w:r>
     </w:p>
     <w:p>
@@ -1272,10 +1528,10 @@
         <w:rPr>
           <w:b/>
         </w:rPr>
-        <w:t>Change-of-Control Vulnerabilities:</w:t>
+        <w:t>Change-of-Control Vulnerabilities</w:t>
       </w:r>
       <w:r>
-        <w:t xml:space="preserve"> If the licensee is acquired by a competitor of the Chinese innovator, the asset's future is jeopardized. Contracts must explicitly dictate how licenses and data rights are handled.</w:t>
+        <w:t>: The licensee being acquired by a competitor of the Chinese innovator, jeopardizing the asset's future. Contracts must explicitly dictate how licenses and data rights are handled in the event of an acquisition.</w:t>
       </w:r>
     </w:p>
     <w:p>
@@ -1289,10 +1545,10 @@
         <w:rPr>
           <w:b/>
         </w:rPr>
-        <w:t>Disappearing Milestones:</w:t>
+        <w:t>Disappearing Milestones</w:t>
       </w:r>
       <w:r>
-        <w:t xml:space="preserve"> Licensees may attempt to restructure clinical development plans post-closing to technically bypass conditions that trigger milestone payments. Precise definitions of triggering events are essential.</w:t>
+        <w:t>: Post-closing restructuring of clinical plans by the licensee to bypass milestone payment triggers. Precise definitions of triggering events are essential in the contract.</w:t>
       </w:r>
     </w:p>
     <w:p>
@@ -1306,10 +1562,10 @@
         <w:rPr>
           <w:b/>
         </w:rPr>
-        <w:t>Ambiguous Data Rights:</w:t>
+        <w:t>Ambiguous Data Rights</w:t>
       </w:r>
       <w:r>
-        <w:t xml:space="preserve"> Clashes over the ownership of clinical data are common. Innovators must ensure they retain sufficient rights to leverage global trial data to support domestic regulatory filings.</w:t>
+        <w:t>: Clashes over the ownership and use of global clinical data to support domestic regulatory filings. Innovators must ensure they retain sufficient rights to leverage global trial data to support domestic regulatory filings in their home markets.</w:t>
       </w:r>
     </w:p>
     <w:p>
@@ -1323,10 +1579,10 @@
         <w:rPr>
           <w:b/>
         </w:rPr>
-        <w:t>Data Integrity and Compliance:</w:t>
+        <w:t>Data Integrity and Compliance</w:t>
       </w:r>
       <w:r>
-        <w:t xml:space="preserve"> MNCs demand rigorous validation that Chinese clinical data meets FDA/EMA standards, requiring absolute compliance with China's cross-border data transfer regulations and clear ownership of AI training data.</w:t>
+        <w:t>: Inability of Chinese clinical data to meet rigorous FDA/EMA standards, triggering regulatory delays. MNCs demand rigorous validation that Chinese clinical data meets FDA/EMA standards, requiring absolute compliance with China's cross-border data transfer regulations and clear ownership of AI training data.</w:t>
       </w:r>
     </w:p>
     <w:p>
@@ -1348,10 +1604,10 @@
     </w:p>
     <w:p>
       <w:pPr>
-        <w:pStyle w:val="Heading1"/>
+        <w:pStyle w:val="Heading2"/>
       </w:pPr>
       <w:r>
-        <w:t>8. Final Thought</w:t>
+        <w:t>7. Final Thought</w:t>
       </w:r>
     </w:p>
     <w:p>
@@ -1359,7 +1615,16 @@
         <w:jc w:val="left"/>
       </w:pPr>
       <w:r>
-        <w:t>AI-native biotechnology represents a fundamental shift in how therapeutics are brought to market. While computational machine learning has successfully solved the upstream math of molecular design, the primary bottleneck of drug development remains clinical trial execution.</w:t>
+        <w:t xml:space="preserve">Ultimately, the transition to the </w:t>
+      </w:r>
+      <w:r>
+        <w:rPr>
+          <w:b/>
+        </w:rPr>
+        <w:t>AI-native biotech</w:t>
+      </w:r>
+      <w:r>
+        <w:t xml:space="preserve"> represents the natural next frontier for the global AI agent disruption. Rather than chasing unrealistic timeline compressions, the true competitive advantage of the AI-native model lies in execution quality, strategic velocity, and risk mitigation. By re-engineering the entire corporate operating biology, a hyper-lean organization can make high-quality clinical decisions faster, identify and diligence high-value clinical assets in minutes, and execute cross-border licensing deals with unprecedented agility. Most importantly, this systematic precision directly targets and eliminates the operational and strategic missteps that currently account for 30% to 50% of drug candidate attrition in traditional, bloated biopharma organizations.</w:t>
       </w:r>
     </w:p>
     <w:p>
@@ -1367,23 +1632,7 @@
         <w:jc w:val="left"/>
       </w:pPr>
       <w:r>
-        <w:t>By deploying networks of autonomous, goal-directed AI agents to augment pivotal clinical roles, utilizing advanced multi-agent architectures to systematically mitigate cognitive bias, and structuring corporate knowledge as a compounding Company Brain codebase, a lean, AI-native team can execute massive Phase 2 and Phase 3 trials with 10x the speed, precision, and capital efficiency of traditional pharmaceutical giants.</w:t>
-      </w:r>
-    </w:p>
-    <w:p>
-      <w:pPr>
-        <w:jc w:val="left"/>
-      </w:pPr>
-      <w:r>
-        <w:t>For the modern biotechnology operator, transitioning to an AI-native operational model is no longer a technological option; it is the ultimate strategic imperative.</w:t>
-      </w:r>
-    </w:p>
-    <w:p>
-      <w:pPr>
-        <w:jc w:val="left"/>
-      </w:pPr>
-      <w:r>
-        <w:t>This memo was prepared using primary research on clinical multi-agent architectures, pharmaceutical R&amp;D cognitive bias surveys, synthetic panel commercial frameworks, and cross-border licensing data as of May 2026.</w:t>
+        <w:t>Operating with just 10% of the tier-1 human labor footprint of traditional biopharma, the AI-native biotech is positioned to run circles around slow-moving legacy conglomerates in the midst of the Chinese asset outbound boom. This paradigm shift represents a once-in-a-lifetime opportunity to build a generational $100 billion to $1 trillion company, commanding an automated swarm of goal-directed AI agents to achieve compounding operational leverage and redefine the future of global therapeutic development.</w:t>
       </w:r>
     </w:p>
     <w:sectPr>

</xml_diff>

<commit_message>
docs: add README.md, register in AGENTS.md, compile updated memo assets
</commit_message>
<xml_diff>
--- a/output/memo.docx
+++ b/output/memo.docx
@@ -7,7 +7,7 @@
         <w:pStyle w:val="Heading1"/>
       </w:pPr>
       <w:r>
-        <w:t>Transitioning to the AI-Native Biotech: Compounding 10x Operational Leverage in Clinical Development</w:t>
+        <w:t>AI-Native Biotech: Building the Next Generational Global AI Company</w:t>
       </w:r>
     </w:p>
     <w:p>
@@ -1624,7 +1624,7 @@
         <w:t>AI-native biotech</w:t>
       </w:r>
       <w:r>
-        <w:t xml:space="preserve"> represents the natural next frontier for the global AI agent disruption. Rather than chasing unrealistic timeline compressions, the true competitive advantage of the AI-native model lies in execution quality, strategic velocity, and risk mitigation. By re-engineering the entire corporate operating biology, a hyper-lean organization can make high-quality clinical decisions faster, identify and diligence high-value clinical assets in minutes, and execute cross-border licensing deals with unprecedented agility. Most importantly, this systematic precision directly targets and eliminates the operational and strategic missteps that currently account for 30% to 50% of drug candidate attrition in traditional, bloated biopharma organizations.</w:t>
+        <w:t xml:space="preserve"> represents the natural next frontier for the global AI agent disruption. The true competitive advantage of the AI-native model lies in execution quality, strategic velocity, and risk mitigation. By re-engineering the entire corporate operating biology, a hyper-lean organization can make high-quality clinical decisions faster, identify and diligence high-value clinical assets in minutes, and execute cross-border licensing deals with unprecedented agility. Most importantly, this systematic precision directly targets and eliminates the operational and strategic missteps that currently account for 30% to 50% of drug candidate attrition in traditional, bloated biopharma organizations.</w:t>
       </w:r>
     </w:p>
     <w:p>

</xml_diff>

<commit_message>
made major edits to the memo
</commit_message>
<xml_diff>
--- a/output/memo.docx
+++ b/output/memo.docx
@@ -21,7 +21,7 @@
         <w:t>Author:</w:t>
       </w:r>
       <w:r>
-        <w:t xml:space="preserve"> Tiger Huang, PLACEHOLDER, PLACEHOLDER, PLACEHOLDER</w:t>
+        <w:t xml:space="preserve"> Tiger Huang</w:t>
       </w:r>
     </w:p>
     <w:p>
@@ -35,7 +35,7 @@
         <w:t>Date:</w:t>
       </w:r>
       <w:r>
-        <w:t xml:space="preserve"> May 2026</w:t>
+        <w:t xml:space="preserve"> June 2026</w:t>
       </w:r>
     </w:p>
     <w:p>
@@ -88,7 +88,7 @@
         <w:t>AI-native biotech</w:t>
       </w:r>
       <w:r>
-        <w:t>—a lean, hyper-agile organization that goes beyond early-stage target math to re-engineer the entire operational biology of the company AI-first and from scratch. In an AI-native biotech, every employee is augmented by a network of goal-directed, autonomous AI agents acting as digital teammates to orchestrate trial protocols, parse patient records, automate regulatory submissions, and eliminate manual "white space" under human-in-the-loop oversight. By replacing legacy administrative handoffs with continuous agentic workflows, an AI-native biotech achieves a 10x operational productivity leap, enables leadership to make high-quality strategic decisions faster, and mitigates critical protocol compliance risks. Crucially, this operational acceleration allows the organization to identify, due diligence, and execute high-value licensing deals with unprecedented agility while systematically avoiding the costly operational and strategic missteps that account for 30% to 50% of drug candidate attrition in traditional, legacy biopharma.</w:t>
+        <w:t>—a lean, compliance-first organization that goes beyond early-stage target math to build a highly structured, compliance-first operational framework from the ground up. Unlike an AI-native tech company that can move fast and break things, an AI-native biotech operates in a highly regulated environment where safety, data integrity, and compliance are paramount. In this model, every operator and executive is augmented by validated, compliance-first AI systems that assist with parsing patient records, drafting regulatory submissions, and monitoring clinical data under strict human-in-the-loop oversight. By replacing legacy administrative handoffs with secure, auditor-ready workflows, the AI-native biotech drives broad organizational adoption of daily AI tools, mitigates protocol compliance risks, and enables leadership to make high-quality strategic decisions faster. Crucially, this operational rigor allows the organization to identify, due diligence, and execute high-value licensing deals with unprecedented agility and safety, systematically avoiding the costly operational and strategic missteps that account for 30% to 50% of drug candidate attrition in traditional, legacy biopharma.</w:t>
       </w:r>
     </w:p>
     <w:p>
@@ -96,7 +96,7 @@
         <w:jc w:val="left"/>
       </w:pPr>
       <w:r>
-        <w:t>Importantly, this compounding operational leverage has immediate, high-leverage applications in global asset sourcing and cross-border licensing. In the wake of the massive Chinese outbound licensing boom (representing a record $135.7 billion in 2025), a three-person AI-native operational team can utilize a compounding Company Brain and screening agents to continuously crawl clinical registries, conduct rigorous data-integrity diligence, and license high-quality, de-risked clinical assets with 10x greater agility than bloated traditional conglomerates.</w:t>
+        <w:t>Importantly, this compounding operational leverage has immediate, high-leverage applications in global asset sourcing and cross-border licensing. In the wake of the massive Chinese outbound licensing boom (representing a record $135.7 billion in 2025), a lean, highly leveraged AI-native operational team can utilize a compounding Company Brain and validated screening agents to continuously crawl clinical registries, conduct rigorous data-integrity diligence, and license high-quality, de-risked clinical assets with 10x greater agility than bloated traditional conglomerates.</w:t>
       </w:r>
     </w:p>
     <w:p>
@@ -104,7 +104,7 @@
         <w:jc w:val="left"/>
       </w:pPr>
       <w:r>
-        <w:t>Ultimately, this paradigm shift represents a once-in-a-lifetime opportunity to build a generational $100 billion to $1 trillion biopharma company. By operating with just 10% of the tier-1 human labor footprint of traditional biopharma and commanding a highly orchestrated swarm of autonomous agents, the AI-native biotech is positioned to run circles around slow-moving legacy organizations and capture unprecedented global market share.</w:t>
+        <w:t>Ultimately, this paradigm shift represents a once-in-a-lifetime opportunity to build a generational $100 billion to $1 trillion biopharma company. By combining the deep experience of clinical leaders with a universally adopted suite of compliance-first AI systems, the AI-native biotech is positioned to run circles around slow-moving, administrative-heavy legacy organizations while maintaining a gold standard of regulatory and scientific integrity.</w:t>
       </w:r>
     </w:p>
     <w:p>
@@ -120,7 +120,25 @@
         <w:jc w:val="left"/>
       </w:pPr>
       <w:r>
-        <w:t>The fundamental goal of the AI-native biotech is to design and build operational processes AI-first and from scratch, rather than attempting to retroactively shoehorn artificial intelligence into legacy clinical frameworks. By re-engineering the company's operational biology, a lean organization staffed by a small team of A-player operators augmented by autonomous agentic systems can achieve a 10x operational productivity leap. While established biopharma conglomerates will undoubtedly maintain their massive capital scale, the AI-native biotech counteracts this advantage with 10x greater operational agility, effectiveness, and execution efficiency—running circles around slow-moving legacy organizations.</w:t>
+        <w:t xml:space="preserve">Unlike a pure </w:t>
+      </w:r>
+      <w:r>
+        <w:rPr>
+          <w:b/>
+        </w:rPr>
+        <w:t>AI-native tech company</w:t>
+      </w:r>
+      <w:r>
+        <w:t xml:space="preserve">—which can deploy flexible, developer-centric agent swarms and operate under a "move fast and break things" engineering philosophy—the </w:t>
+      </w:r>
+      <w:r>
+        <w:rPr>
+          <w:b/>
+        </w:rPr>
+        <w:t>AI-native biotech</w:t>
+      </w:r>
+      <w:r>
+        <w:t xml:space="preserve"> is defined by a compliance-first, safety-centric paradigm of universal AI adoption. Because biotechnology is a highly regulated industry governed by older, deeply experienced clinical leaders, operational systems cannot rely on unpredictable autonomous loops. Instead, the core definition of an AI-native biotech is an organization that drives the daily, universal adoption of secure AI tools across all departments, backed by highly intentional, validated autonomous agents engineered specifically to withstand rigorous regulatory scrutiny (such as FDA and EMA audits).</w:t>
       </w:r>
     </w:p>
     <w:p>
@@ -128,23 +146,7 @@
         <w:jc w:val="left"/>
       </w:pPr>
       <w:r>
-        <w:t>While the concept of the AI-native biotechnology company has gained rapid traction across academic research and peer-reviewed literature, it has yet to see major, public traction in the broader commercial industry. Most established biopharma companies remain anchored to legacy enterprise software and manual operating models, leaving a massive strategic vacuum for early adopters. A growing consensus of literature highlights the unique capabilities of goal-directed, autonomous clinical agents to coordinate complex clinical trials and automate operations. By synthesizing peer-reviewed frameworks and real-world operational benchmarks, we can establish the formal foundations of this paradigm shift.</w:t>
-      </w:r>
-    </w:p>
-    <w:p>
-      <w:pPr>
-        <w:jc w:val="left"/>
-      </w:pPr>
-      <w:r>
-        <w:t>At its core, an AI-native biotech is defined by the operational integration of networks of goal-directed, autonomous AI agents acting as digital teammates across the entire drug development lifecycle. Unlike legacy developers, business operations here are designed AI-first: workflows are built to enable agents to proactively orchestrate tasks, parse unstructured patient records, reason through clinical protocols, and draft GxP-compliant regulatory filings under human oversight.</w:t>
-      </w:r>
-    </w:p>
-    <w:p>
-      <w:pPr>
-        <w:jc w:val="left"/>
-      </w:pPr>
-      <w:r>
-        <w:t>This approach is fundamentally distinct from traditional machine learning (ML) platforms that currently dominate upstream drug discovery. While traditional ML excels at predicting target binding affinities or optimizing molecular structures, these static, isolated models do not reason or address downstream clinical execution. The AI-native biotech picks up where upstream discovery ends, leveraging agentic systems to solve the downstream trial bottlenecks that govern whether a therapeutic asset actually reaches a patient.</w:t>
+        <w:t>Rather than adapting legacy processes to accommodate modern software, the operational biology of the company is designed AI-first: AI systems assist in parsing unstructured anonymized patient records, structuring clinical databases, and drafting GxP-compliant regulatory filings under strict, multi-step human-in-the-loop authorization. This approach yields a highly agile organization where clinical operators are significantly leveraged, compressing development timelines and eliminating manual administrative "white space" during high-stakes Phase 2 and Phase 3 trials. While traditional biopharma conglomerates maintain massive capital scale, the AI-native biotech counteracts this with superior operational agility, data readiness, and execution safety.</w:t>
       </w:r>
     </w:p>
     <w:p>
@@ -152,111 +154,7 @@
         <w:pStyle w:val="Heading3"/>
       </w:pPr>
       <w:r>
-        <w:t>Research 1: ClinicalAgent — Outcomes and Timeline Prediction</w:t>
-      </w:r>
-    </w:p>
-    <w:p>
-      <w:pPr>
-        <w:pStyle w:val="Quote"/>
-      </w:pPr>
-      <w:r>
-        <w:rPr>
-          <w:b/>
-          <w:i/>
-        </w:rPr>
-        <w:t>Profile:</w:t>
-      </w:r>
-      <w:r>
-        <w:rPr>
-          <w:i/>
-        </w:rPr>
-        <w:t xml:space="preserve"> A multi-agent framework utilizing GPT-4 with Reasoning and Acting (ReAct) and Least-to-Most prompting structures to function as a virtual clinical team.</w:t>
-      </w:r>
-    </w:p>
-    <w:p>
-      <w:pPr>
-        <w:jc w:val="left"/>
-      </w:pPr>
-      <w:r>
-        <w:t xml:space="preserve">Developed by Yue et al. (2024), </w:t>
-      </w:r>
-      <w:r>
-        <w:rPr>
-          <w:b/>
-        </w:rPr>
-        <w:t>ClinicalAgent</w:t>
-      </w:r>
-      <w:r>
-        <w:t xml:space="preserve"> integrates patient data and historical trial metrics. It improved trial outcome and failure prediction by 0.33 AUC over baseline prompting methods, while dynamically predicting enrollment timelines and highlighting potential bottlenecks. (https://arxiv.org/abs/2404.14777)</w:t>
-      </w:r>
-    </w:p>
-    <w:p>
-      <w:pPr>
-        <w:pStyle w:val="Heading3"/>
-      </w:pPr>
-      <w:r>
-        <w:t>Research 2: MAKAR — Eligibility Matching</w:t>
-      </w:r>
-    </w:p>
-    <w:p>
-      <w:pPr>
-        <w:pStyle w:val="Quote"/>
-      </w:pPr>
-      <w:r>
-        <w:rPr>
-          <w:b/>
-          <w:i/>
-        </w:rPr>
-        <w:t>Profile:</w:t>
-      </w:r>
-      <w:r>
-        <w:rPr>
-          <w:i/>
-        </w:rPr>
-        <w:t xml:space="preserve"> A double-module multi-agent system designed to automate patient-trial eligibility matching with strict data privacy guarantees.</w:t>
-      </w:r>
-    </w:p>
-    <w:p>
-      <w:pPr>
-        <w:jc w:val="left"/>
-      </w:pPr>
-      <w:r>
-        <w:t xml:space="preserve">Developed by Shi et al. (2024), </w:t>
-      </w:r>
-      <w:r>
-        <w:rPr>
-          <w:b/>
-        </w:rPr>
-        <w:t>MAKAR</w:t>
-      </w:r>
-      <w:r>
-        <w:t xml:space="preserve"> utilizes an Augmentation Module to translate ambiguous inclusion/exclusion criteria into clear clinical concepts, and a Reasoning Module with Collaborator, Critique, and Navigator agents to match patient charts. It achieved an average F1-score improvement of 7% to 8% across clinical datasets and reached 100% accuracy in controlled matching tasks, executing locally to ensure patient data privacy. (https://arxiv.org/abs/2411.14637)</w:t>
-      </w:r>
-    </w:p>
-    <w:p>
-      <w:pPr>
-        <w:pStyle w:val="Heading3"/>
-      </w:pPr>
-      <w:r>
-        <w:t>Research 3: BioXconomy CRA Analysis — Risk-Based Monitoring</w:t>
-      </w:r>
-    </w:p>
-    <w:p>
-      <w:pPr>
-        <w:pStyle w:val="Quote"/>
-      </w:pPr>
-      <w:r>
-        <w:rPr>
-          <w:b/>
-          <w:i/>
-        </w:rPr>
-        <w:t>Profile:</w:t>
-      </w:r>
-      <w:r>
-        <w:rPr>
-          <w:i/>
-        </w:rPr>
-        <w:t xml:space="preserve"> An industry analysis demonstrating the efficiency of risk-based monitoring agents in handling routine verification and reporting.</w:t>
+        <w:t>Paradigm: The Asset-Agnostic Portfolio Model</w:t>
       </w:r>
     </w:p>
     <w:p>
@@ -270,10 +168,26 @@
         <w:rPr>
           <w:b/>
         </w:rPr>
-        <w:t>BioXconomy CRA Analysis</w:t>
+        <w:t>Asset-Agnostic Portfolio Model</w:t>
       </w:r>
       <w:r>
-        <w:t xml:space="preserve"> demonstrates that risk-based monitoring agents handle 80% of routine verification, site messaging, and monitoring report generation. This shifts human CRAs from travel-heavy administrative auditing to high-value medical oversight. (https://www.bioxconomy.com/clinical-and-research/how-ai-agents-are-transforming-the-clinical-trial-process-for-cras)</w:t>
+        <w:t xml:space="preserve"> is an operational model that secures sufficient funding to operate a diversified portfolio of 10 to 20 assets managed by a hyper-efficient, agent-augmented team, systematically diversifying scientific risks and avoiding single-asset talent sequestration.</w:t>
+      </w:r>
+    </w:p>
+    <w:p>
+      <w:pPr>
+        <w:jc w:val="left"/>
+      </w:pPr>
+      <w:r>
+        <w:t>This model represents a major capital allocation paradigm shift. The existing biotech venture capital funding model is fundamentally mismatched with this operational reality. The status quo VC funding structure is highly fragmented and focused on specific assets, creating numerous sub-scale companies that sequester and waste elite talent—such as a world-class Chief Medical Officer spending 100% of their time on a single clinical asset that is already in trial. Under this legacy structure, the best possible outcome is a $2 billion acquisition by a large pharmaceutical conglomerate, which when risk-adjusted and split among the team and investors represents an insufficient payout for any party involved.</w:t>
+      </w:r>
+    </w:p>
+    <w:p>
+      <w:pPr>
+        <w:jc w:val="left"/>
+      </w:pPr>
+      <w:r>
+        <w:t>Rather than chasing single-asset exits, the AI-native biotech targets the creation of a $100 billion generational company by managerially evolving to become a dynamic portfolio manager—constantly in-licensing clinical candidates, executing rapid-turnaround trials via agentic automation, and out-licensing successful therapeutics. Through this model, the AI-native biotech disintermediates legacy biotech VCs by leveraging a superior talent pool, proprietary technology, and a more robust, diversified funding structure.</w:t>
       </w:r>
     </w:p>
     <w:p>
@@ -281,25 +195,7 @@
         <w:pStyle w:val="Heading3"/>
       </w:pPr>
       <w:r>
-        <w:t>Research 4: Human Oversight Dynamics</w:t>
-      </w:r>
-    </w:p>
-    <w:p>
-      <w:pPr>
-        <w:pStyle w:val="Quote"/>
-      </w:pPr>
-      <w:r>
-        <w:rPr>
-          <w:b/>
-          <w:i/>
-        </w:rPr>
-        <w:t>Definition:</w:t>
-      </w:r>
-      <w:r>
-        <w:rPr>
-          <w:i/>
-        </w:rPr>
-        <w:t xml:space="preserve"> A structured operational framework governing the interaction between human clinical staff and autonomous AI agents to ensure safety and system stability.</w:t>
+        <w:t>Example: Formation Bio</w:t>
       </w:r>
     </w:p>
     <w:p>
@@ -307,7 +203,87 @@
         <w:jc w:val="left"/>
       </w:pPr>
       <w:r>
-        <w:t>While these tools represent massive technical advancements, their successful deployment requires a rigorous sociotechnical framework. As highlighted in a 2026 publication in JMIR AI, clinical deployment is not a purely technical matching challenge. Instead, organizations must explicitly configure oversight intensity, override authority, explanation timing, and escalation logic to prevent workflow disruption and ensure patient safety. (https://doi.org/10.2196/95899)</w:t>
+        <w:t xml:space="preserve">The primary real-world validation of this asset-agnostic, portfolio-driven approach is </w:t>
+      </w:r>
+      <w:r>
+        <w:rPr>
+          <w:b/>
+        </w:rPr>
+        <w:t>Formation Bio</w:t>
+      </w:r>
+      <w:r>
+        <w:t xml:space="preserve">. Originally founded in 2016 as </w:t>
+      </w:r>
+      <w:r>
+        <w:rPr>
+          <w:b/>
+        </w:rPr>
+        <w:t>TrialSpark</w:t>
+      </w:r>
+      <w:r>
+        <w:t xml:space="preserve"> to modernize clinical trial operations, the company rebranded in December 2023 to codify its transition from a tech-enabled services vendor into a fully integrated, AI-native pharmaceutical developer. Rather than competing in early-stage drug discovery—which is already well-served by upstream statistical machine learning—Formation Bio focuses its proprietary AI platform downstream on clinical trial execution, targeting the industry's primary bottleneck. By leveraging its operational speed as a structural advantage, the company has deployed a textbook version of the asset-agnostic model: in-licensing high-potential, clinical-stage candidates and developing them under a centralized, tech-driven hub-and-spoke structure.</w:t>
+      </w:r>
+    </w:p>
+    <w:p>
+      <w:pPr>
+        <w:jc w:val="left"/>
+      </w:pPr>
+      <w:r>
+        <w:t xml:space="preserve">To execute this portfolio strategy without sequestering talent, Formation Bio establishes dedicated, asset-centric subsidiaries (NewCos) supported by its core AI-native operating platform. These spokes include </w:t>
+      </w:r>
+      <w:r>
+        <w:rPr>
+          <w:b/>
+        </w:rPr>
+        <w:t>Riverview Bio</w:t>
+      </w:r>
+      <w:r>
+        <w:t xml:space="preserve">, which in-licensed a first-in-class anti-CD226 monoclonal antibody for autoimmune indications from IMIDomics in July 2025, and </w:t>
+      </w:r>
+      <w:r>
+        <w:rPr>
+          <w:b/>
+        </w:rPr>
+        <w:t>Bleecker Bio</w:t>
+      </w:r>
+      <w:r>
+        <w:t>, which in-licensed a CNS-penetrant, allosteric TYK2 inhibitor (</w:t>
+      </w:r>
+      <w:r>
+        <w:rPr>
+          <w:b/>
+        </w:rPr>
+        <w:t>LNK01006</w:t>
+      </w:r>
+      <w:r>
+        <w:t xml:space="preserve"> / </w:t>
+      </w:r>
+      <w:r>
+        <w:rPr>
+          <w:b/>
+        </w:rPr>
+        <w:t>BLKR201</w:t>
+      </w:r>
+      <w:r>
+        <w:t xml:space="preserve">) from Lynk Pharmaceuticals in December 2025 and dosed its first Phase 1 patient in June 2026. Rather than staffing each spoke with a full, redundant executive team, the centralized AI-native engine manages the trials. This operational leverage is funded by a $372 million </w:t>
+      </w:r>
+      <w:r>
+        <w:rPr>
+          <w:b/>
+        </w:rPr>
+        <w:t>Series D financing</w:t>
+      </w:r>
+      <w:r>
+        <w:t xml:space="preserve"> secured in June 2024—led by Andreessen Horowitz (a16z) with significant participation from Sanofi—and is supercharged by a three-way partnership with OpenAI and Sanofi to build custom software, including the patient-recruitment engine </w:t>
+      </w:r>
+      <w:r>
+        <w:rPr>
+          <w:b/>
+        </w:rPr>
+        <w:t>Muse</w:t>
+      </w:r>
+      <w:r>
+        <w:t xml:space="preserve"> launched in November 2024. By applying validated AI systems across a diversified portfolio, Formation Bio demonstrates how a lean, highly leveraged team can run multiple clinical-stage programs simultaneously, compressing timelines and driving high-fidelity execution at a fraction of legacy costs.</w:t>
       </w:r>
     </w:p>
     <w:p>
@@ -315,7 +291,7 @@
         <w:pStyle w:val="Heading2"/>
       </w:pPr>
       <w:r>
-        <w:t>2. 360 Degrees AI Adoption</w:t>
+        <w:t>2. The Convergence of Agentic Productivity and the China Asset Boom</w:t>
       </w:r>
     </w:p>
     <w:p>
@@ -323,7 +299,7 @@
         <w:jc w:val="left"/>
       </w:pPr>
       <w:r>
-        <w:t>In an AI-native biotech, agent integration is ubiquitous. Everyone—from the Chief Medical Officer to the clinical quality manager—works with and through autonomous AI agents.</w:t>
+        <w:t>A 10x operational productivity leap is economically meaningless in a vacuum. If a lean organization cannot secure a steady volume of clinical candidates to populate its pipeline, the speed and efficiency of its agentic teammates are wasted. Agentic productivity requires an abundance of assets to manage—otherwise, the capacity is squandered on sub-scale operations.</w:t>
       </w:r>
     </w:p>
     <w:p>
@@ -331,25 +307,51 @@
         <w:jc w:val="left"/>
       </w:pPr>
       <w:r>
-        <w:t xml:space="preserve">To achieve this state in the current market, organizations must navigate a practical reality: clinical and business teams must rely on developer-centric tools like </w:t>
+        <w:t xml:space="preserve">The massive expansion of Chinese biopharma provides the necessary high-quality raw material to feed this agentic engine. In 2025, </w:t>
       </w:r>
       <w:r>
         <w:rPr>
           <w:b/>
         </w:rPr>
-        <w:t>OpenCode</w:t>
+        <w:t>China outbound licensing</w:t>
       </w:r>
       <w:r>
-        <w:t xml:space="preserve"> or the </w:t>
+        <w:t xml:space="preserve"> agreements reached a record $135.7 billion, representing one-third of all global licensing spend and making China the primary source of licensable drug assets. This growth is driven by a powerful economic and clinical arbitrage: discovery costs in China are 30% to 40% lower, and clinical enrollment is 2 to 3 times faster due to patient density. This allows access to high-quality, de-risked clinical-stage assets at highly attractive valuations. Proven clinical successes like </w:t>
       </w:r>
       <w:r>
         <w:rPr>
           <w:b/>
         </w:rPr>
-        <w:t>Hermes Agent</w:t>
+        <w:t>CARVYKTI</w:t>
       </w:r>
       <w:r>
-        <w:t xml:space="preserve"> core. While these reasoning-dense frameworks can initially feel unfamiliar or awkward to clinical operators used to legacy enterprise software, they represent the most mature, high-reasoning agent cores available in the market today. Rather than waiting for polished, proprietary enterprise software, the AI-native biotech embraces this initial friction to secure an immediate, structural head start, while actively building business-friendly, model-agnostic, and open-source equivalents.</w:t>
+        <w:t xml:space="preserve"> (J&amp;J CAR-T), </w:t>
+      </w:r>
+      <w:r>
+        <w:rPr>
+          <w:b/>
+        </w:rPr>
+        <w:t>Tislelizumab</w:t>
+      </w:r>
+      <w:r>
+        <w:t xml:space="preserve"> (Novartis PD-1), and </w:t>
+      </w:r>
+      <w:r>
+        <w:rPr>
+          <w:b/>
+        </w:rPr>
+        <w:t>Ivonescimab</w:t>
+      </w:r>
+      <w:r>
+        <w:t xml:space="preserve"> (Summit PD-1/VEGF)—along with massive deals like the GSK/Hengrui transaction ($12.5 billion)—demonstrate that Chinese-origin therapeutics represent a world-class clinical standard.</w:t>
+      </w:r>
+    </w:p>
+    <w:p>
+      <w:pPr>
+        <w:pStyle w:val="Heading3"/>
+      </w:pPr>
+      <w:r>
+        <w:t>Example: Diligence Velocity</w:t>
       </w:r>
     </w:p>
     <w:p>
@@ -357,43 +359,15 @@
         <w:jc w:val="left"/>
       </w:pPr>
       <w:r>
-        <w:t xml:space="preserve">To maintain operational sovereignty and manage cost, the AI-native biotech operates under four core strategic imperatives. First, it must deploy a </w:t>
+        <w:t>Traditional biopharma conglomerates cannot keep pace with this asset volume due to the immense manual diligence required to evaluate cross-border candidates. An AI-native team, however, leverages agentic workflows to screen hundreds of candidates simultaneously. To illustrate, I held a two-hour session with a biotech executive demonstrating that an agentic workflow (using Antigravity with Gemini) could perform a comprehensive pathway scan. It evaluated seven distinct databases in Chinese and English, producing a detailed profile of 31 assets with citations and hallucination checks—a task that typically consumes a week of labor for three elite associates.</w:t>
       </w:r>
+    </w:p>
+    <w:p>
+      <w:pPr>
+        <w:pStyle w:val="Heading3"/>
+      </w:pPr>
       <w:r>
-        <w:rPr>
-          <w:b/>
-        </w:rPr>
-        <w:t>model-agnostic infrastructure</w:t>
-      </w:r>
-      <w:r>
-        <w:t xml:space="preserve"> using a flexible orchestration layer to decouple the model layer from core workflows, maintaining absolute flexibility to swap providers as capabilities evolve. Second, it must practice </w:t>
-      </w:r>
-      <w:r>
-        <w:rPr>
-          <w:b/>
-        </w:rPr>
-        <w:t>active token cost management</w:t>
-      </w:r>
-      <w:r>
-        <w:t xml:space="preserve"> by routing simple data-mapping tasks to cost-effective local models and reserving frontier API models for complex reasoning. Third, it must mandate an </w:t>
-      </w:r>
-      <w:r>
-        <w:rPr>
-          <w:b/>
-        </w:rPr>
-        <w:t>open architecture</w:t>
-      </w:r>
-      <w:r>
-        <w:t xml:space="preserve"> that preserves clean boundaries between models and applications to resist vendor lock-in. Finally, it must initialize </w:t>
-      </w:r>
-      <w:r>
-        <w:rPr>
-          <w:b/>
-        </w:rPr>
-        <w:t>agent-friendly markdown workflows</w:t>
-      </w:r>
-      <w:r>
-        <w:t>, minimizing PowerPoint in favor of structured Markdown to enable seamless agentic ingestion and reasoning.</w:t>
+        <w:t>Example: Data Integrity</w:t>
       </w:r>
     </w:p>
     <w:p>
@@ -401,7 +375,32 @@
         <w:jc w:val="left"/>
       </w:pPr>
       <w:r>
-        <w:t>Achieving a complete, 360-degree adoption of AI requires integrating these digital teammates across every critical function, particularly as the company's gravity shifts from upstream target discovery to downstream clinical execution. Below, we outline how key clinical development roles adopt goal-directed, autonomous agents to drive this operational reality across every major organizational domain—compressing timelines, eliminating administrative friction, and securing 10x operational leverage:</w:t>
+        <w:t xml:space="preserve">Accessing this arbitrage requires navigating historical quality challenges, such as the 80% trial application withdrawal rate stemming from the 2015 CFDA self-audit. While regulatory standards and ICH alignment have modernized, rigorous, agent-driven audits of unstructured patient records are essential to detect data anomalies and </w:t>
+      </w:r>
+      <w:r>
+        <w:rPr>
+          <w:b/>
+        </w:rPr>
+        <w:t>Good Clinical Practice (GCP)</w:t>
+      </w:r>
+      <w:r>
+        <w:t xml:space="preserve"> breaches prior to licensing.</w:t>
+      </w:r>
+    </w:p>
+    <w:p>
+      <w:pPr>
+        <w:pStyle w:val="Heading2"/>
+      </w:pPr>
+      <w:r>
+        <w:t>3. What would an AI-native biotech really look like</w:t>
+      </w:r>
+    </w:p>
+    <w:p>
+      <w:pPr>
+        <w:jc w:val="left"/>
+      </w:pPr>
+      <w:r>
+        <w:t>The operational framework of an AI-native biotech is structured across three distinct layers, scaling from daily universal adoption by senior leadership to highly validated, compliance-first autonomous agents.</w:t>
       </w:r>
     </w:p>
     <w:p>
@@ -409,7 +408,32 @@
         <w:pStyle w:val="Heading3"/>
       </w:pPr>
       <w:r>
-        <w:t>Domain 1: Clinical Development &amp; Biometrics</w:t>
+        <w:t>Layer 1: Universal Daily AI Tooling for Senior Leadership</w:t>
+      </w:r>
+    </w:p>
+    <w:p>
+      <w:pPr>
+        <w:jc w:val="left"/>
+      </w:pPr>
+      <w:r>
+        <w:t xml:space="preserve">True AI integration must begin with senior leadership. Most biotechnology executives and clinical directors finish their academic training in their early thirties and remain established in legacy, PowerPoint and email-driven operational habits. This behavioral inertia is compounded by the fact that modern AI tooling remains highly tuned to software developers. Business executives do not have access to the most powerful orchestrators and environment contexts; instead, they are forced to interact with simplistic text boxes. For example, this memo is being drafted using </w:t>
+      </w:r>
+      <w:r>
+        <w:rPr>
+          <w:b/>
+        </w:rPr>
+        <w:t>Antigravity</w:t>
+      </w:r>
+      <w:r>
+        <w:t>—a developer-centric, workspace-aware AI agent that executes complex research and file modifications—which is structurally far more capable than standard consumer AI assistants integrated into Google Docs, even when running on the exact same underlying model.</w:t>
+      </w:r>
+    </w:p>
+    <w:p>
+      <w:pPr>
+        <w:jc w:val="left"/>
+      </w:pPr>
+      <w:r>
+        <w:t>The AI-native biotech bridges this gap by shifting the executive paradigm from administrative delegation to direct agentic interaction. In this model, an AI-native executive does not task their team with retrieving basic regulatory timelines or literature updates; they query the AI first. More importantly, document review is transformed from an untracked, manual feedback loop into a deterministic engineering process. If an executive wants to enforce a specific scientific modification or formatting rule across a protocol draft, they do not send a manual email that could be ignored, or worse, give verbal feedback that leaves no audit trail. Instead, they instruct the AI to update the global system skill auditing the document. From that point forward, every subsequent draft generated until final release is programmatically checked against this rule, guaranteeing compliance and eliminating human oversight errors.</w:t>
       </w:r>
     </w:p>
     <w:p>
@@ -417,25 +441,7 @@
         <w:pStyle w:val="Heading3"/>
       </w:pPr>
       <w:r>
-        <w:t>Role 1: The Chief Medical Officer — Protocol Orchestration</w:t>
-      </w:r>
-    </w:p>
-    <w:p>
-      <w:pPr>
-        <w:pStyle w:val="Quote"/>
-      </w:pPr>
-      <w:r>
-        <w:rPr>
-          <w:b/>
-          <w:i/>
-        </w:rPr>
-        <w:t>Profile:</w:t>
-      </w:r>
-      <w:r>
-        <w:rPr>
-          <w:i/>
-        </w:rPr>
-        <w:t xml:space="preserve"> Senior clinical strategist responsible for trial design and protocol development, augmented by multi-agent swarms to automate compliant designs.</w:t>
+        <w:t>Layer 2: The Custom Workflow AI Skill Portfolio</w:t>
       </w:r>
     </w:p>
     <w:p>
@@ -443,42 +449,25 @@
         <w:jc w:val="left"/>
       </w:pPr>
       <w:r>
-        <w:t xml:space="preserve">The </w:t>
+        <w:t xml:space="preserve">To maintain GxP compliance and scientific rigor, the organization relies on a portfolio of pre-configured, validated AI skills. The development and continuous maintenance of these skills represent the company’s highest leverage source of value. Rather than using generic prompts, a small, elite team of hybrid clinical-technical operators writes highly robust </w:t>
       </w:r>
       <w:r>
         <w:rPr>
           <w:b/>
         </w:rPr>
-        <w:t>Chief Medical Officer (CMO)</w:t>
+        <w:t>custom agent skills</w:t>
       </w:r>
       <w:r>
-        <w:t xml:space="preserve"> leverages clinical multi-agent swarms to automate ICH M11-compliant protocol design. Specialized Protocol Design, Protocol Burden, and Protocol Auditor agents check representativeness, evaluate patient burden, and audit designs against regulatory guidelines. This compresses protocol drafting timelines from 6–9 months to under 2 weeks—a 10x productivity leap—while lowering downstream protocol amendments by up to 80%.</w:t>
+        <w:t xml:space="preserve"> backed by rigorous </w:t>
       </w:r>
-    </w:p>
-    <w:p>
-      <w:pPr>
-        <w:pStyle w:val="Heading3"/>
-      </w:pPr>
-      <w:r>
-        <w:t>Role 2: The Lead Biostatistician — Analytical Programming</w:t>
-      </w:r>
-    </w:p>
-    <w:p>
-      <w:pPr>
-        <w:pStyle w:val="Quote"/>
-      </w:pPr>
       <w:r>
         <w:rPr>
           <w:b/>
-          <w:i/>
         </w:rPr>
-        <w:t>Profile:</w:t>
+        <w:t>evaluation suites (evals)</w:t>
       </w:r>
       <w:r>
-        <w:rPr>
-          <w:i/>
-        </w:rPr>
-        <w:t xml:space="preserve"> Quantitative expert responsible for statistical powering and trial data analysis, utilizing automated double-programming pipelines.</w:t>
+        <w:t>. These custom skills sit as the critical translation layer between the clinical layman and raw, complex technical AI capabilities. When combined with simple, deterministic Python helper scripts (such as custom database query utilities or PDF text extractors), these skills allow AI agents to navigate files and execute complex clinical tasks with total completeness and zero hallucination.</w:t>
       </w:r>
     </w:p>
     <w:p>
@@ -486,459 +475,7 @@
         <w:jc w:val="left"/>
       </w:pPr>
       <w:r>
-        <w:t xml:space="preserve">The </w:t>
-      </w:r>
-      <w:r>
-        <w:rPr>
-          <w:b/>
-        </w:rPr>
-        <w:t>Lead Biostatistician</w:t>
-      </w:r>
-      <w:r>
-        <w:t xml:space="preserve"> deploys multi-agent biostatistics programming pipelines. An autonomous SAP Architect Agent ingests raw EDC schemas to draft the statistical analysis plan (SAP), while parallel Code Generator and Audit agents automatically write GxP-compliant SAS/R scripts. The agents perform independent double-programming to mathematically verify results, completely eliminating manual coding backlogs and accelerating Table, Listing, and Figure (TLF) generation by 10x.</w:t>
-      </w:r>
-    </w:p>
-    <w:p>
-      <w:pPr>
-        <w:pStyle w:val="Heading3"/>
-      </w:pPr>
-      <w:r>
-        <w:t>Domain 2: Clinical Operations (ClinOps)</w:t>
-      </w:r>
-    </w:p>
-    <w:p>
-      <w:pPr>
-        <w:pStyle w:val="Heading3"/>
-      </w:pPr>
-      <w:r>
-        <w:t>Role 3: The Head of Clinical Operations — Trial Orchestration</w:t>
-      </w:r>
-    </w:p>
-    <w:p>
-      <w:pPr>
-        <w:pStyle w:val="Quote"/>
-      </w:pPr>
-      <w:r>
-        <w:rPr>
-          <w:b/>
-          <w:i/>
-        </w:rPr>
-        <w:t>Profile:</w:t>
-      </w:r>
-      <w:r>
-        <w:rPr>
-          <w:i/>
-        </w:rPr>
-        <w:t xml:space="preserve"> Operational leader managing global clinical trial sites, enrollment, and variable costs via agentic CTMS integrations.</w:t>
-      </w:r>
-    </w:p>
-    <w:p>
-      <w:pPr>
-        <w:jc w:val="left"/>
-      </w:pPr>
-      <w:r>
-        <w:t xml:space="preserve">The </w:t>
-      </w:r>
-      <w:r>
-        <w:rPr>
-          <w:b/>
-        </w:rPr>
-        <w:t>Head of Clinical Operations</w:t>
-      </w:r>
-      <w:r>
-        <w:t xml:space="preserve"> deploys autonomous ClinOps agents integrated directly with the Electronic Data Capture (EDC) and Clinical Trial Management System (CTMS). Using ReAct-based multi-agent frameworks (such as ClinicalAgent), the agents dynamically track global enrollment velocities and predict trial duration. Operational bottlenecks and protocol compliance risks are flagged before they cause multi-week delays, allowing the director to oversee 10x more sites and patients per FTE.</w:t>
-      </w:r>
-    </w:p>
-    <w:p>
-      <w:pPr>
-        <w:pStyle w:val="Heading3"/>
-      </w:pPr>
-      <w:r>
-        <w:t>Role 4: The CRO Management Lead — Vendor Governance</w:t>
-      </w:r>
-    </w:p>
-    <w:p>
-      <w:pPr>
-        <w:pStyle w:val="Quote"/>
-      </w:pPr>
-      <w:r>
-        <w:rPr>
-          <w:b/>
-          <w:i/>
-        </w:rPr>
-        <w:t>Profile:</w:t>
-      </w:r>
-      <w:r>
-        <w:rPr>
-          <w:i/>
-        </w:rPr>
-        <w:t xml:space="preserve"> Vendor manager governing Contract Research Organizations and monitoring budgets through autonomous billing audit agents.</w:t>
-      </w:r>
-    </w:p>
-    <w:p>
-      <w:pPr>
-        <w:jc w:val="left"/>
-      </w:pPr>
-      <w:r>
-        <w:t xml:space="preserve">The </w:t>
-      </w:r>
-      <w:r>
-        <w:rPr>
-          <w:b/>
-        </w:rPr>
-        <w:t>CRO Management Lead</w:t>
-      </w:r>
-      <w:r>
-        <w:t xml:space="preserve"> employs autonomous contract and billing audit agents. The agents continuously ingest weekly CRO status updates, matching them against patient records and CTMS logs to verify clinical milestones. Discrepancies, delayed data entry, or billing anomalies are flagged automatically, reducing manual verification by 10x and enabling a single lead to govern multiple global CRO vendors simultaneously with zero administrative overhead.</w:t>
-      </w:r>
-    </w:p>
-    <w:p>
-      <w:pPr>
-        <w:pStyle w:val="Heading3"/>
-      </w:pPr>
-      <w:r>
-        <w:t>Domain 3: CMC &amp; Supply Chain</w:t>
-      </w:r>
-    </w:p>
-    <w:p>
-      <w:pPr>
-        <w:pStyle w:val="Heading3"/>
-      </w:pPr>
-      <w:r>
-        <w:t>Role 5: The VP of CMC — Manufacturing Dossier Assembly</w:t>
-      </w:r>
-    </w:p>
-    <w:p>
-      <w:pPr>
-        <w:pStyle w:val="Quote"/>
-      </w:pPr>
-      <w:r>
-        <w:rPr>
-          <w:b/>
-          <w:i/>
-        </w:rPr>
-        <w:t>Profile:</w:t>
-      </w:r>
-      <w:r>
-        <w:rPr>
-          <w:i/>
-        </w:rPr>
-        <w:t xml:space="preserve"> Chemistry, Manufacturing, and Controls leader scaling batch production to GMP standards, augmented by real-time sensor audit agents.</w:t>
-      </w:r>
-    </w:p>
-    <w:p>
-      <w:pPr>
-        <w:jc w:val="left"/>
-      </w:pPr>
-      <w:r>
-        <w:t xml:space="preserve">The </w:t>
-      </w:r>
-      <w:r>
-        <w:rPr>
-          <w:b/>
-        </w:rPr>
-        <w:t>VP of CMC</w:t>
-      </w:r>
-      <w:r>
-        <w:t xml:space="preserve"> deploys CMC monitoring agents that ingest real-time Process Analytical Technology (PAT) sensor data and manufacturing run records. The agents automatically analyze stability profiles, identify chemical purity deviations, and draft Module 3 (Quality) of the Common Technical Document (CTD). By automating 90% of data extraction during tech transfer, the agent compiles compliance dossiers 10x faster with zero transcription errors.</w:t>
-      </w:r>
-    </w:p>
-    <w:p>
-      <w:pPr>
-        <w:pStyle w:val="Heading3"/>
-      </w:pPr>
-      <w:r>
-        <w:t>Role 6: The Clinical Supply Chain Manager — Inventory Simulation</w:t>
-      </w:r>
-    </w:p>
-    <w:p>
-      <w:pPr>
-        <w:pStyle w:val="Quote"/>
-      </w:pPr>
-      <w:r>
-        <w:rPr>
-          <w:b/>
-          <w:i/>
-        </w:rPr>
-        <w:t>Profile:</w:t>
-      </w:r>
-      <w:r>
-        <w:rPr>
-          <w:i/>
-        </w:rPr>
-        <w:t xml:space="preserve"> Logistics manager ensuring uninterrupted global clinical supply chain operations using demand-supply simulation agents.</w:t>
-      </w:r>
-    </w:p>
-    <w:p>
-      <w:pPr>
-        <w:jc w:val="left"/>
-      </w:pPr>
-      <w:r>
-        <w:t xml:space="preserve">The </w:t>
-      </w:r>
-      <w:r>
-        <w:rPr>
-          <w:b/>
-        </w:rPr>
-        <w:t>Clinical Supply Chain Manager</w:t>
-      </w:r>
-      <w:r>
-        <w:t xml:space="preserve"> utilizes intelligent inventory planning agents connected to the Interactive Response Technology (IRT/RTSM). The agents run real-time demand-supply simulations, analyzing enrollment rates, shipping durations, and cold-chain temperature logs. Replenishment orders are dynamically calculated and queued to prevent patient stockouts while reducing drug waste by over 50%, resulting in a 10x planning efficiency gain.</w:t>
-      </w:r>
-    </w:p>
-    <w:p>
-      <w:pPr>
-        <w:pStyle w:val="Heading3"/>
-      </w:pPr>
-      <w:r>
-        <w:t>Domain 4: Regulatory Affairs &amp; Quality Assurance (QA/QC)</w:t>
-      </w:r>
-    </w:p>
-    <w:p>
-      <w:pPr>
-        <w:pStyle w:val="Heading3"/>
-      </w:pPr>
-      <w:r>
-        <w:t>Role 7: The VP of Regulatory Affairs — Submission Swarm Orchestration</w:t>
-      </w:r>
-    </w:p>
-    <w:p>
-      <w:pPr>
-        <w:pStyle w:val="Quote"/>
-      </w:pPr>
-      <w:r>
-        <w:rPr>
-          <w:b/>
-          <w:i/>
-        </w:rPr>
-        <w:t>Profile:</w:t>
-      </w:r>
-      <w:r>
-        <w:rPr>
-          <w:i/>
-        </w:rPr>
-        <w:t xml:space="preserve"> Regulatory lead driving the NDA/BLA dossier assembly via automated multi-agent drafting and auditing swarms.</w:t>
-      </w:r>
-    </w:p>
-    <w:p>
-      <w:pPr>
-        <w:jc w:val="left"/>
-      </w:pPr>
-      <w:r>
-        <w:t xml:space="preserve">The </w:t>
-      </w:r>
-      <w:r>
-        <w:rPr>
-          <w:b/>
-        </w:rPr>
-        <w:t>VP of Regulatory Affairs</w:t>
-      </w:r>
-      <w:r>
-        <w:t xml:space="preserve"> orchestrates a multi-agent regulatory submission swarm. Specialized drafting agents ingest raw preclinical and clinical dossiers to generate Module 2 (Summaries) and Module 5 (Clinical Study Reports) of the CTD. In parallel, a dedicated Auditor Agent cross-references every drafted clinical claim directly back to source SAS tables. This compresses the timeline for NDA/BLA dossier assembly from several months to under two weeks, achieving a 10x productivity leap.</w:t>
-      </w:r>
-    </w:p>
-    <w:p>
-      <w:pPr>
-        <w:pStyle w:val="Heading3"/>
-      </w:pPr>
-      <w:r>
-        <w:t>Role 8: The Head of Clinical Quality — Inspection Readiness Auditing</w:t>
-      </w:r>
-    </w:p>
-    <w:p>
-      <w:pPr>
-        <w:pStyle w:val="Quote"/>
-      </w:pPr>
-      <w:r>
-        <w:rPr>
-          <w:b/>
-          <w:i/>
-        </w:rPr>
-        <w:t>Profile:</w:t>
-      </w:r>
-      <w:r>
-        <w:rPr>
-          <w:i/>
-        </w:rPr>
-        <w:t xml:space="preserve"> Quality assurance lead ensuring GCP compliance through continuous eTMF and EDC background auditing agents.</w:t>
-      </w:r>
-    </w:p>
-    <w:p>
-      <w:pPr>
-        <w:jc w:val="left"/>
-      </w:pPr>
-      <w:r>
-        <w:t xml:space="preserve">The </w:t>
-      </w:r>
-      <w:r>
-        <w:rPr>
-          <w:b/>
-        </w:rPr>
-        <w:t>Head of Clinical Quality</w:t>
-      </w:r>
-      <w:r>
-        <w:t xml:space="preserve"> deploys continuous inspection-readiness agents. The agents run persistent background audits across the electronic Trial Master File (eTMF) and EDC, automatically classifying documents against the DIA TMF Reference Model and identifying incomplete signatures or missing files. This shifts GCP compliance from high-stress quarterly audits to a continuous, real-time readiness model, reducing inspection preparation workloads by 10x.</w:t>
-      </w:r>
-    </w:p>
-    <w:p>
-      <w:pPr>
-        <w:pStyle w:val="Heading3"/>
-      </w:pPr>
-      <w:r>
-        <w:t>Domain 5: Commercial Readiness &amp; Market Access</w:t>
-      </w:r>
-    </w:p>
-    <w:p>
-      <w:pPr>
-        <w:pStyle w:val="Heading3"/>
-      </w:pPr>
-      <w:r>
-        <w:t>Role 9: The Chief Commercial Officer — Launch Readiness</w:t>
-      </w:r>
-    </w:p>
-    <w:p>
-      <w:pPr>
-        <w:pStyle w:val="Quote"/>
-      </w:pPr>
-      <w:r>
-        <w:rPr>
-          <w:b/>
-          <w:i/>
-        </w:rPr>
-        <w:t>Profile:</w:t>
-      </w:r>
-      <w:r>
-        <w:rPr>
-          <w:i/>
-        </w:rPr>
-        <w:t xml:space="preserve"> Commercial leader mapping competitive landscapes and GTM strategies using crawling and medical communication agents.</w:t>
-      </w:r>
-    </w:p>
-    <w:p>
-      <w:pPr>
-        <w:jc w:val="left"/>
-      </w:pPr>
-      <w:r>
-        <w:t xml:space="preserve">The </w:t>
-      </w:r>
-      <w:r>
-        <w:rPr>
-          <w:b/>
-        </w:rPr>
-        <w:t>Chief Commercial Officer (CCO)</w:t>
-      </w:r>
-      <w:r>
-        <w:t xml:space="preserve"> utilizes competitive intelligence and medical communications agents. The agents continuously crawl trial registries, conference abstracts, and medical literature to map the changing competitive landscape. Marketing agents automatically translate clinical trial data into compliant draft medical communications, scientific slide decks, and educational materials, accelerating commercial launch readiness and custom content preparation by 10x.</w:t>
-      </w:r>
-    </w:p>
-    <w:p>
-      <w:pPr>
-        <w:pStyle w:val="Heading3"/>
-      </w:pPr>
-      <w:r>
-        <w:t>Role 10: The Market Access Director — HEOR Synthesis</w:t>
-      </w:r>
-    </w:p>
-    <w:p>
-      <w:pPr>
-        <w:pStyle w:val="Quote"/>
-      </w:pPr>
-      <w:r>
-        <w:rPr>
-          <w:b/>
-          <w:i/>
-        </w:rPr>
-        <w:t>Profile:</w:t>
-      </w:r>
-      <w:r>
-        <w:rPr>
-          <w:i/>
-        </w:rPr>
-        <w:t xml:space="preserve"> HEOR specialist demonstrating clinical cost-effectiveness and running automated pricing simulations for global payers.</w:t>
-      </w:r>
-    </w:p>
-    <w:p>
-      <w:pPr>
-        <w:jc w:val="left"/>
-      </w:pPr>
-      <w:r>
-        <w:t xml:space="preserve">The </w:t>
-      </w:r>
-      <w:r>
-        <w:rPr>
-          <w:b/>
-        </w:rPr>
-        <w:t>Market Access &amp; HEOR Director</w:t>
-      </w:r>
-      <w:r>
-        <w:t xml:space="preserve"> leverages HEOR synthesis agents that ingest clinical efficacy metrics, real-world evidence (RWE), and patient-reported outcomes to automatically generate health economic dossiers. The agents run extensive Monte Carlo simulations to test pricing strategies against global reimbursement frameworks, reducing modeling cycle times by 10x and allowing the director to customize value dossiers for multiple payers concurrently.</w:t>
-      </w:r>
-    </w:p>
-    <w:p>
-      <w:pPr>
-        <w:pStyle w:val="Heading3"/>
-      </w:pPr>
-      <w:r>
-        <w:t>Domain 6: Capital Strategy</w:t>
-      </w:r>
-    </w:p>
-    <w:p>
-      <w:pPr>
-        <w:pStyle w:val="Heading3"/>
-      </w:pPr>
-      <w:r>
-        <w:t>Role 11: The CFO — Capital Strategy and Cash Burn Simulation</w:t>
-      </w:r>
-    </w:p>
-    <w:p>
-      <w:pPr>
-        <w:pStyle w:val="Quote"/>
-      </w:pPr>
-      <w:r>
-        <w:rPr>
-          <w:b/>
-          <w:i/>
-        </w:rPr>
-        <w:t>Profile:</w:t>
-      </w:r>
-      <w:r>
-        <w:rPr>
-          <w:i/>
-        </w:rPr>
-        <w:t xml:space="preserve"> Financial strategist balancing fixed operating costs against clinical trial variables using automated Monte Carlo forecasting.</w:t>
-      </w:r>
-    </w:p>
-    <w:p>
-      <w:pPr>
-        <w:jc w:val="left"/>
-      </w:pPr>
-      <w:r>
-        <w:t xml:space="preserve">The </w:t>
-      </w:r>
-      <w:r>
-        <w:rPr>
-          <w:b/>
-        </w:rPr>
-        <w:t>CFO</w:t>
-      </w:r>
-      <w:r>
-        <w:t xml:space="preserve"> implements automated financial forecasting networks. The agents continuously ingest patient recruitment speeds, CMC process validation costs, and variable CRO invoices to execute live Monte Carlo cash burn simulations. By dynamically forecasting runway under various enrollment scenarios and drafting milestone-driven fundraising proposals, the CFO achieves a 10x speedup in capital planning cycles, ensuring proactive, risk-mitigated financial management.</w:t>
-      </w:r>
-    </w:p>
-    <w:p>
-      <w:pPr>
-        <w:pStyle w:val="Heading2"/>
-      </w:pPr>
-      <w:r>
-        <w:t>3. Decision Support: Technical Mitigation of Human Bias</w:t>
-      </w:r>
-    </w:p>
-    <w:p>
-      <w:pPr>
-        <w:jc w:val="left"/>
-      </w:pPr>
-      <w:r>
-        <w:t>Cognitive biases systematically distort pharmaceutical R&amp;D decisions, particularly at the critical "Go/No-Go" stage gates where massive capital is committed. A landmark 2022 survey of 92 senior pharmaceutical industry practitioners, published in Nature Reviews Drug Discovery, identified the most prevalent cognitive biases:</w:t>
+        <w:t>To govern day-to-day operations, the organization maintains three primary clinical skills within this portfolio:</w:t>
       </w:r>
     </w:p>
     <w:p>
@@ -949,10 +486,10 @@
         <w:rPr>
           <w:b/>
         </w:rPr>
-        <w:t>Confirmation Bias (57% prevalence)</w:t>
+        <w:t>Business Development Scan</w:t>
       </w:r>
       <w:r>
-        <w:t>: Designing trials to confirm hypotheses, selecting favorable endpoints, and ignoring contradictory evidence. (https://sdg.com/publications/mitigating-biases-in-pharmaceutical-rd-decision-making)</w:t>
+        <w:t>: This skill pairs an agentic search workflow with local Python parsers to continuously monitor global clinical registries, outbound pipelines, and financial databases. By running automated checks against pre-defined data-integrity benchmarks, a two-person BD team can simultaneously audit hundreds of potential in-licensing assets, automatically flagging candidates that exhibit high data-integrity risks or clinical anomalies.</w:t>
       </w:r>
     </w:p>
     <w:p>
@@ -963,10 +500,10 @@
         <w:rPr>
           <w:b/>
         </w:rPr>
-        <w:t>Champion Bias</w:t>
+        <w:t>Scientific Evidence Review</w:t>
       </w:r>
       <w:r>
-        <w:t>: Evaluating a plan or proposal based on the track record of the person presenting it, or overweighing a senior champion's personal view.</w:t>
+        <w:t>: Rather than relying on selective human reading or search engines, this skill ingests the entire clinical literature corpus for a target pathway (often thousands of PDFs) into a large-context processing engine. Supported by local extraction scripts, the agent synthesizes the scientific landscape, resolves conflicting trial outcomes, and outputs a structured review where every claim is cited verbatim to a primary source document, preventing selection bias and hallucination.</w:t>
       </w:r>
     </w:p>
     <w:p>
@@ -977,10 +514,43 @@
         <w:rPr>
           <w:b/>
         </w:rPr>
-        <w:t>Sunk-Cost Fallacy</w:t>
+        <w:t>Clinical Trial Protocol Review</w:t>
       </w:r>
       <w:r>
-        <w:t>: Continuing failing clinical programs due to cumulative historical spending rather than future probability of success. (https://www.drugpatentwatch.com/blog/decision-making-product-portfolios-pharmaceutical-research-development-managing-streams-innovation-highly-regulated-markets)</w:t>
+        <w:t>: This skill acts as a real-time compliance auditor for clinical trial protocols. It programmatically scans draft protocols against international therapeutic guidelines, historical FDA/EMA review documents, and internal GxP rules. Any design flaws, safety monitoring gaps, or statistical inconsistencies are highlighted automatically, ensuring the protocol is inspection-ready before submission.</w:t>
+      </w:r>
+    </w:p>
+    <w:p>
+      <w:pPr>
+        <w:pStyle w:val="Heading3"/>
+      </w:pPr>
+      <w:r>
+        <w:t>Layer 3: Compliance-First Autonomous Agents</w:t>
+      </w:r>
+    </w:p>
+    <w:p>
+      <w:pPr>
+        <w:jc w:val="left"/>
+      </w:pPr>
+      <w:r>
+        <w:t xml:space="preserve">For complex, long-running operational workflows, the organization deploys highly specialized, compliance-first autonomous agents. Unlike the experimental, non-deterministic "agent swarms" of tech startups, these agents run on strict, deterministic rails and write detailed, unalterable log trails to ensure full auditability under regulatory scrutiny. In a highly regulated biotech environment, safety governance and compliance are paramount; the system must be architected under a </w:t>
+      </w:r>
+      <w:r>
+        <w:rPr>
+          <w:b/>
+        </w:rPr>
+        <w:t>compliance-first</w:t>
+      </w:r>
+      <w:r>
+        <w:t xml:space="preserve"> paradigm. If a Trial Manager Assistant were to overlook a critical adverse event, or if a Synthetic KOL were to output an erroneous pathway analysis with deadly clinical implications, the consequences would be catastrophic. In these high-stakes scenarios, blaming human error is irrelevant; the system itself must enforce fail-safe verification layers.</w:t>
+      </w:r>
+    </w:p>
+    <w:p>
+      <w:pPr>
+        <w:jc w:val="left"/>
+      </w:pPr>
+      <w:r>
+        <w:t>To maintain absolute safety and auditability, the autonomous agent tier is engineered around three core structural guardrails:</w:t>
       </w:r>
     </w:p>
     <w:p>
@@ -991,10 +561,56 @@
         <w:rPr>
           <w:b/>
         </w:rPr>
-        <w:t>Groupthink and Consensus Bias</w:t>
+        <w:t>Tamper-Evident Audit Trails</w:t>
       </w:r>
       <w:r>
-        <w:t>: Governance committees converging on premature consensus, actively suppressing critical dissent and minority opinions, as corroborated by Bieske et al. in Drug Discovery Today. (https://www.alacrita.com/blog/the-hidden-pitfalls-of-unconscious-bias-in-drug-development)</w:t>
+        <w:t>: Every decision, database query, and tool execution performed by an agent is captured in a cryptographically signed, immutable transaction log. This ensures that regulatory auditors can trace the exact lineage of any clinical study report or protocol recommendation back to its raw database sources.</w:t>
+      </w:r>
+    </w:p>
+    <w:p>
+      <w:pPr>
+        <w:pStyle w:val="ListBullet"/>
+      </w:pPr>
+      <w:r>
+        <w:rPr>
+          <w:b/>
+        </w:rPr>
+        <w:t>Multi-Agent Verification Loops</w:t>
+      </w:r>
+      <w:r>
+        <w:t xml:space="preserve">: Agents do not operate in isolation. The primary execution agent is continuously monitored by independent </w:t>
+      </w:r>
+      <w:r>
+        <w:rPr>
+          <w:i/>
+        </w:rPr>
+        <w:t>critic</w:t>
+      </w:r>
+      <w:r>
+        <w:t xml:space="preserve"> and </w:t>
+      </w:r>
+      <w:r>
+        <w:rPr>
+          <w:i/>
+        </w:rPr>
+        <w:t>compliance validator</w:t>
+      </w:r>
+      <w:r>
+        <w:t xml:space="preserve"> agents. These validators run separate, deterministic scripts to verify the correctness of the primary agent's output before it is ever staged for human review.</w:t>
+      </w:r>
+    </w:p>
+    <w:p>
+      <w:pPr>
+        <w:pStyle w:val="ListBullet"/>
+      </w:pPr>
+      <w:r>
+        <w:rPr>
+          <w:b/>
+        </w:rPr>
+        <w:t>Hardcoded Clinical Fail-Safes</w:t>
+      </w:r>
+      <w:r>
+        <w:t>: All agents are bound by strict, non-bypassable code boundaries. If an agent detects a critical safety signal—such as a Serious Adverse Event (SAE) in the EDC database—it initiates a hardcoded escalation protocol. The agent cannot close the ticket autonomously; it must trigger multiple redundant alert channels (SMS, email, and CTMS notifications) to human clinical directors and CRA managers, escalating to senior medical officers if confirmation is not received within a strict SLA window.</w:t>
       </w:r>
     </w:p>
     <w:p>
@@ -1002,7 +618,49 @@
         <w:jc w:val="left"/>
       </w:pPr>
       <w:r>
-        <w:t>To operationalize mitigations, the AI-native biotech deploys disinterested, non-incentivized program reviewing agents. These agents ingest and synthesize a volume of context that far exceeds human limits—including thousands of clinical trials, RWE datasets, regulatory precedents, and safety alerts. By cross-referencing disparate databases in real time, agents detect hidden, horizontal correlations (such as systemic safety signals across mechanistically unrelated trials, CMC anomalies, or shifts in regulatory precedents) that would remain siloed to human teams. Furthermore, agents continuously evaluate trial data against target product profiles (TPPs), alerting teams immediately of deviations and acting as disinterested "No-Go" advocates who face no career risk for recommending termination.</w:t>
+        <w:t>To execute these end-to-end clinical operations, the AI-native biotech maintains three core autonomous agent archetypes:</w:t>
+      </w:r>
+    </w:p>
+    <w:p>
+      <w:pPr>
+        <w:pStyle w:val="ListBullet"/>
+      </w:pPr>
+      <w:r>
+        <w:rPr>
+          <w:b/>
+        </w:rPr>
+        <w:t>Synthetic Key Opinion Leader (KOL)</w:t>
+      </w:r>
+      <w:r>
+        <w:t>: Models virtual advisory panels by compiling publication histories, clinical databases, and regulatory guidelines into specialized agent personas to stress-test clinical strategy and messaging before human engagement.</w:t>
+      </w:r>
+    </w:p>
+    <w:p>
+      <w:pPr>
+        <w:pStyle w:val="ListBullet"/>
+      </w:pPr>
+      <w:r>
+        <w:rPr>
+          <w:b/>
+        </w:rPr>
+        <w:t>Company Brain</w:t>
+      </w:r>
+      <w:r>
+        <w:t>: Compiles institutional research, clinical data, and organizational history into a structured, persistent, and compounding codebase that provides a single source of truth for the organization.</w:t>
+      </w:r>
+    </w:p>
+    <w:p>
+      <w:pPr>
+        <w:pStyle w:val="ListBullet"/>
+      </w:pPr>
+      <w:r>
+        <w:rPr>
+          <w:b/>
+        </w:rPr>
+        <w:t>Trial Manager Assistant</w:t>
+      </w:r>
+      <w:r>
+        <w:t>: Parses active clinical databases (such as EDC and CTMS) in real time to monitor trial operations, coordinate site logistics, and alert clinical teams to GCP violations and operational bottlenecks.</w:t>
       </w:r>
     </w:p>
     <w:p>
@@ -1010,7 +668,7 @@
         <w:jc w:val="left"/>
       </w:pPr>
       <w:r>
-        <w:t>The key operational mechanism for this bias mitigation is remarkably straightforward. While the human brain is highly susceptible to cognitive fatigue and recency bias—consistently over-indexing on the most recently read study, the most dramatic competitor press release, or the loudest voice in a committee room—autonomous AI agents operate without fatigue or emotional attachment. An agentic system can simultaneously consume, synthesize, and objectively weigh data across 10 to 20 recent clinical studies, historical trials, and regulatory precedents in active memory. By presenting a statistically grounded, comprehensive evidence base that does not favor any single recent outcome, these agents counteract the recency bias and emotional anchoring that so frequently lead human clinical boards to make disastrous Go/No-Go decisions.</w:t>
+        <w:t>By combining cryptographically signed logs, multi-agent validation loops, and hardcoded safety guardrails, these three core agent archetypes represent the technical and operational maturity of the AI-native biotech. The sections below analyze the clinical architecture and safety governance of each autonomous system in detail.</w:t>
       </w:r>
     </w:p>
     <w:p>
@@ -1026,7 +684,15 @@
         <w:jc w:val="left"/>
       </w:pPr>
       <w:r>
-        <w:t>Key Opinion Leaders (KOLs), global regulatory authorities, and healthcare payers represent the critical external stakeholders whose validation determines a therapeutic asset's regulatory and commercial success. However, engaging human experts, regulators, and insurance payers is exceptionally slow, expensive, and constrained by organizational mindshare—with standard KOL advisory rates ranging from $400 to $600 per hour, and regulatory feedback taking months to secure.</w:t>
+        <w:t>Key external stakeholders—such as Key Opinion Leaders (KOLs), global regulatory authorities, and healthcare payers—represent the critical checkpoints whose validation determines a therapeutic asset's regulatory and commercial success. Engaging these groups is historically slow, expensive, and constrained by organizational mindshare.</w:t>
+      </w:r>
+    </w:p>
+    <w:p>
+      <w:pPr>
+        <w:pStyle w:val="Heading3"/>
+      </w:pPr>
+      <w:r>
+        <w:t>Persona: The Synthetic Key Opinion Leader</w:t>
       </w:r>
     </w:p>
     <w:p>
@@ -1034,34 +700,16 @@
         <w:jc w:val="left"/>
       </w:pPr>
       <w:r>
-        <w:t xml:space="preserve">To resolve this bottleneck, the AI-native biotech instantiates virtual advisory panels that represent these distinct, hard-to-reach personas. By translating the publications, patents, clinical trial registries, and public statements of global experts, regulatory guidelines (e.g., FDA/EMA guidance documents), and historical insurance coverage decisions into customized agent personas, the organization can simulate multi-stakeholder advisory boards at will. This includes simulating not only synthetic </w:t>
+        <w:t xml:space="preserve">A </w:t>
       </w:r>
       <w:r>
         <w:rPr>
           <w:b/>
         </w:rPr>
-        <w:t>Key Opinion Leaders</w:t>
+        <w:t>Synthetic Key Opinion Leader</w:t>
       </w:r>
       <w:r>
-        <w:t xml:space="preserve"> to evaluate scientific merit, but also virtual </w:t>
-      </w:r>
-      <w:r>
-        <w:rPr>
-          <w:b/>
-        </w:rPr>
-        <w:t>regulatory auditors</w:t>
-      </w:r>
-      <w:r>
-        <w:t xml:space="preserve"> to stress-test filing dossiers for compliance gaps, and synthetic </w:t>
-      </w:r>
-      <w:r>
-        <w:rPr>
-          <w:b/>
-        </w:rPr>
-        <w:t>healthcare payers</w:t>
-      </w:r>
-      <w:r>
-        <w:t xml:space="preserve"> to critique pricing and reimbursement frameworks long before formal submission.</w:t>
+        <w:t xml:space="preserve"> is a virtual advisory entity constructed by translating dense clinical publications, patents, registries, and past statements of therapeutic experts into customized agent personas.</w:t>
       </w:r>
     </w:p>
     <w:p>
@@ -1069,7 +717,7 @@
         <w:jc w:val="left"/>
       </w:pPr>
       <w:r>
-        <w:t>The AI-native biotech addresses this bottleneck by translating the publications, patents, clinical trial registries, and public statements of global experts into highly customized, virtual expert personas. This approach rests on a well-established behavioral premise: in real life, prominent scientific experts and academic physicians rarely deviate from their long-established, public beliefs and past intellectual frameworks. They operate within highly consistent, observable patterns.</w:t>
+        <w:t>This approach rests on a well-established behavioral premise: in real life, prominent scientific experts and academic physicians rarely deviate from their long-established, public beliefs and past statements. They operate within highly consistent, observable intellectual frameworks. By leveraging advanced language models, the AI-native biotech translates these publications, patents, clinical trial registries, regulatory guidelines, and insurance coverage histories into highly customized virtual expert personas. This expands advisory panels beyond traditional KOLs to include virtual regulatory auditors and synthetic healthcare payers.</w:t>
       </w:r>
     </w:p>
     <w:p>
@@ -1077,7 +725,7 @@
         <w:jc w:val="left"/>
       </w:pPr>
       <w:r>
-        <w:t>By using commercial platforms and frameworks calibrated against real-world data, the organization can instantiate virtual expert panels at a fraction of the cost:</w:t>
+        <w:t>The value proposition of these panels centers on accessibility and speed:</w:t>
       </w:r>
     </w:p>
     <w:p>
@@ -1088,10 +736,10 @@
         <w:rPr>
           <w:b/>
         </w:rPr>
-        <w:t>Commercial Cost Reduction</w:t>
+        <w:t>Fingertip Accessibility</w:t>
       </w:r>
       <w:r>
-        <w:t>: Platforms like Delve AI can generate synthetic panels at a cost of approximately $0.99 to $2.00 per synthetic user, compared to traditional focus groups that cost $15,000 to $30,000 per session. (https://www.delve.ai/blog/synthetic-panels)</w:t>
+        <w:t>: The primary value is not the direct cost savings—although significant, as Delve AI shows synthetic respondents cost $0.99–$2.00 versus $400–$600 for human interviews.</w:t>
       </w:r>
     </w:p>
     <w:p>
@@ -1113,7 +761,7 @@
         <w:jc w:val="left"/>
       </w:pPr>
       <w:r>
-        <w:t>However, deploying synthetic KOL panels introduces critical risks. LLMs tend toward consensus, which can suppress highly novel, eccentric, or contrarian insights—the "novelty suppression" or "missing 23%" problem, where an LLM hybrid recovered 77% of themes but missed the critical 23% of highly specific, non-obvious human insights. (https://sloanreview.mit.edu/article/gain-consumer-insight-with-generative-ai/) Furthermore, organizations must avoid the "Researcher as Demiurge" problem, where a researcher who constructs both the synthetic respondent and the AI moderator runs the risk of conducting a conversation with a sophisticated echo of their own assumptions, leading to comforting but incorrect conclusions.</w:t>
+        <w:t>However, deploying synthetic panels introduces critical risks. Language models tend toward consensus, suppressing highly novel, eccentric, or contrarian insights—the "novelty suppression" or "missing 23%" problem, where LLMs fail to recover specific human insights. Furthermore, organizations must avoid the "Demiurge" problem, where a researcher constructing both the synthetic respondent and the moderator runs the risk of creating a sophisticated echo chamber of their own assumptions.</w:t>
       </w:r>
     </w:p>
     <w:p>
@@ -1121,7 +769,7 @@
         <w:jc w:val="left"/>
       </w:pPr>
       <w:r>
-        <w:t xml:space="preserve">To mitigate these risks, the AI-native biotech enforces a strict operational safeguard: </w:t>
+        <w:t xml:space="preserve">To mitigate these dynamics, the operational architecture must enforce strict </w:t>
       </w:r>
       <w:r>
         <w:rPr>
@@ -1130,7 +778,15 @@
         <w:t>Adversarial Separation</w:t>
       </w:r>
       <w:r>
-        <w:t>. The team responsible for designing, prompting, and maintaining the synthetic KOL panel must be entirely independent of the strategic team evaluating the output and making final R&amp;D and portfolio decisions. (https://doi.org/10.1016/j.socscimed.2025.117552)</w:t>
+        <w:t>. The team designing and prompting the synthetic KOL panel must be entirely independent of the strategic team evaluating the output and making final R&amp;D decisions. Most importantly, because a regulated biotech cannot afford a "move fast and break things" engineering posture, these synthetic panels are never used to bypass actual human trials or official regulatory interactions. Instead, they serve as preliminary stress-testing guardrails to ensure clinical trial designs and regulatory narratives are robust, safe, and fully aligned with known regulatory compliance baselines before any clinical work is executed.</w:t>
+      </w:r>
+    </w:p>
+    <w:p>
+      <w:pPr>
+        <w:jc w:val="left"/>
+      </w:pPr>
+      <w:r>
+        <w:t>To prevent erroneous synthetic insights from guiding critical R&amp;D decisions with lethal real-world implications, the governance model enforces a strict scientific escalation rule: any protocol or strategic direction suggested by a synthetic panel must undergo formal, empirical laboratory validation and human-led scientific advisory board approval before capital is allocated or regulatory filings are initiated. It is irrelevant whether human error is involved; the system itself enforces this double-key validation gate.</w:t>
       </w:r>
     </w:p>
     <w:p>
@@ -1146,7 +802,7 @@
         <w:jc w:val="left"/>
       </w:pPr>
       <w:r>
-        <w:t>In a traditional biotechnology organization, critical knowledge is siloed across thousands of clinical protocols, scientific papers, meeting transcripts, and vendor invoices. Standard search or basic enterprise RAG (Retrieval-Augmented Generation) systems parse these documents from scratch on every query, leading to high latency, repetitive computational costs, and zero long-term accumulation of corporate intelligence.</w:t>
+        <w:t>In a traditional biotechnology organization, critical knowledge is siloed across thousands of clinical protocols, scientific papers, meeting transcripts, and vendor invoices. Standard search or basic enterprise Retrieval-Augmented Generation (RAG) systems parse these documents from scratch on every query, leading to high latency, repetitive computational costs, and zero long-term accumulation of corporate intelligence.</w:t>
       </w:r>
     </w:p>
     <w:p>
@@ -1154,7 +810,7 @@
         <w:jc w:val="left"/>
       </w:pPr>
       <w:r>
-        <w:t xml:space="preserve">To solve this, the AI-native biotech implements a persistent, compounding </w:t>
+        <w:t xml:space="preserve">Y Combinator's Summer 2026 Request for Startups (RFS) explicitly highlights the </w:t>
       </w:r>
       <w:r>
         <w:rPr>
@@ -1163,7 +819,23 @@
         <w:t>Company Brain</w:t>
       </w:r>
       <w:r>
-        <w:t xml:space="preserve"> structured around Andrej Karpathy's </w:t>
+        <w:t xml:space="preserve"> as the critical, missing layer between raw corporate data and reliable AI automation. It is the living, structured map of how a company works, turning fragmented files into executable skills for agents.</w:t>
+      </w:r>
+    </w:p>
+    <w:p>
+      <w:pPr>
+        <w:pStyle w:val="Heading3"/>
+      </w:pPr>
+      <w:r>
+        <w:t>Paradigm: The LLM Wiki</w:t>
+      </w:r>
+    </w:p>
+    <w:p>
+      <w:pPr>
+        <w:jc w:val="left"/>
+      </w:pPr>
+      <w:r>
+        <w:t xml:space="preserve">To solve the silo issue, the AI-native biotech implements Andrej Karpathy's </w:t>
       </w:r>
       <w:r>
         <w:rPr>
@@ -1172,15 +844,7 @@
         <w:t>LLM Wiki</w:t>
       </w:r>
       <w:r>
-        <w:t xml:space="preserve"> paradigm. Rather than treating document processing as a series of isolated, ephemeral tasks, the LLM Wiki functions as a living codebase of corporate knowledge. When new information is introduced, autonomous agents compile, reconcile, and integrate it once, updating a persistent, interconnected web of markdown concept pages and resolving contradictions.</w:t>
-      </w:r>
-    </w:p>
-    <w:p>
-      <w:pPr>
-        <w:jc w:val="left"/>
-      </w:pPr>
-      <w:r>
-        <w:t>This architecture is organized into a robust three-layer system:</w:t>
+        <w:t xml:space="preserve"> paradigm—a persistent codebase of structured markdown files where autonomous agents compile, reconcile, and integrate raw institutional data once, replacing ephemeral RAG pipelines with compounding corporate knowledge. When a new source is introduced, the agent compiles and integrates it once, updating concept pages and resolving contradictions. This architecture is organized into a robust three-layer system:</w:t>
       </w:r>
     </w:p>
     <w:p>
@@ -1197,7 +861,7 @@
         <w:t>Raw Sources (Immutable)</w:t>
       </w:r>
       <w:r>
-        <w:t>: The foundational repository of primary source documents, including clinical protocols, academic literature, competitive trial registries, and CRO invoices.</w:t>
+        <w:t>: Scientific papers, clinical protocols, trial registries, meeting transcripts.</w:t>
       </w:r>
     </w:p>
     <w:p>
@@ -1214,7 +878,7 @@
         <w:t>The Wiki (Persistent Markdown)</w:t>
       </w:r>
       <w:r>
-        <w:t>: A highly structured, agent-maintained directory of concept maps, molecule profiles, manufacturing process dossiers, and operational guidelines.</w:t>
+        <w:t>: A structured directory of concept maps, molecule profiles, and operational guides written and maintained by the agent.</w:t>
       </w:r>
     </w:p>
     <w:p>
@@ -1228,18 +892,10 @@
         <w:rPr>
           <w:b/>
         </w:rPr>
-        <w:t>The Schema (Rules and Metacognition)</w:t>
+        <w:t>The Schema (Rules &amp; Metacognition)</w:t>
       </w:r>
       <w:r>
-        <w:t>: A central configuration file (conceptually aligned with `AGENTS.md`) that explicitly defines directories, formatting standards, and ingestion boundaries for autonomous agents.</w:t>
-      </w:r>
-    </w:p>
-    <w:p>
-      <w:pPr>
-        <w:jc w:val="left"/>
-      </w:pPr>
-      <w:r>
-        <w:t>This technical architecture is validated by Y Combinator's Summer 2026 Request for Startups (RFS), which highlights the "Company Brain" as the critical, missing layer between raw corporate data and reliable agentic automation (https://www.ycombinator.com/rfs).</w:t>
+        <w:t>: A central configuration file (e.g., `AGENTS.md`) defining the boundaries, directory structures, and ingestion standards.</w:t>
       </w:r>
     </w:p>
     <w:p>
@@ -1258,10 +914,10 @@
         <w:rPr>
           <w:b/>
         </w:rPr>
-        <w:t>Source Ingestion</w:t>
+        <w:t>Ingest</w:t>
       </w:r>
       <w:r>
-        <w:t>: When a team member uploads a raw document, agents analyze the content, automatically update the central catalog index, and immediately propagate relevant insights across 10 to 15 interconnected concept pages.</w:t>
+        <w:t>: Ingesting a raw source automatically updates the central catalog index and propagates changes across 10–15 related concept files.</w:t>
       </w:r>
     </w:p>
     <w:p>
@@ -1272,10 +928,10 @@
         <w:rPr>
           <w:b/>
         </w:rPr>
-        <w:t>Synthesis and Retrieval</w:t>
+        <w:t>Query</w:t>
       </w:r>
       <w:r>
-        <w:t>: Instead of querying raw database tables or running unstructured keyword searches, operators query the structured Wiki index to instantly retrieve comprehensive, expert-level strategic briefs with every claim directly cited back to immutable raw sources.</w:t>
+        <w:t>: The agent reads a structured index catalog to locate highly relevant pages and synthesize answers with exact citations.</w:t>
       </w:r>
     </w:p>
     <w:p>
@@ -1286,10 +942,10 @@
         <w:rPr>
           <w:b/>
         </w:rPr>
-        <w:t>Continuous Auditing (Linting)</w:t>
+        <w:t>Lint</w:t>
       </w:r>
       <w:r>
-        <w:t>: Autonomous agentic pipelines run persistent background audits to detect logical contradictions between old and new files (such as a protocol amendment that contradicts a manufacturing dossier), identify knowledge gaps, and automatically repair broken cross-references.</w:t>
+        <w:t>: The agent executes periodic background audits to flag contradictions between old and new data, identify knowledge gaps, and repair broken cross-references.</w:t>
       </w:r>
     </w:p>
     <w:p>
@@ -1297,7 +953,47 @@
         <w:jc w:val="left"/>
       </w:pPr>
       <w:r>
-        <w:t xml:space="preserve">Furthermore, the LLM Wiki is entirely language-agnostic, enabling a global clinical operations team to operate seamlessly across borders with perfect translation and synchronization. Crucially, the Company Brain represents a fundamental evolution beyond passive, static enterprise storage systems such as Confluence or SharePoint. By ingesting not just static reference documents but also active meeting memos, trial dashboards, strategic board discussions, and clinical stage-gate decisions, it functions as a centralized, dynamic </w:t>
+        <w:t>The wiki relies on two main structured files:</w:t>
+      </w:r>
+    </w:p>
+    <w:p>
+      <w:pPr>
+        <w:pStyle w:val="ListBullet"/>
+      </w:pPr>
+      <w:r>
+        <w:t>`index.md`: A categorized catalog of all wiki pages containing links and one-line summaries.</w:t>
+      </w:r>
+    </w:p>
+    <w:p>
+      <w:pPr>
+        <w:pStyle w:val="ListBullet"/>
+      </w:pPr>
+      <w:r>
+        <w:t>`log.md`: An append-only, chronological journal of all operations.</w:t>
+      </w:r>
+    </w:p>
+    <w:p>
+      <w:pPr>
+        <w:jc w:val="left"/>
+      </w:pPr>
+      <w:r>
+        <w:t>To meet GxP compliance standards, every ingestion, query, and background reconciliation performed by the Company Brain must generate a cryptographic, tamper-evident audit trail. This ensures that every synthesized concept, protocol analysis, or source reference can be traced back directly to its primary source and validated during regulatory audits.</w:t>
+      </w:r>
+    </w:p>
+    <w:p>
+      <w:pPr>
+        <w:jc w:val="left"/>
+      </w:pPr>
+      <w:r>
+        <w:t>This system delivers a major operational outcome: a smaller, highly leveraged clinical team operates with total, unified context. The LLM Wiki is entirely language-agnostic, enabling global clinical teams to operate seamlessly across borders with perfect translation and synchronization.</w:t>
+      </w:r>
+    </w:p>
+    <w:p>
+      <w:pPr>
+        <w:jc w:val="left"/>
+      </w:pPr>
+      <w:r>
+        <w:t xml:space="preserve">Crucially, the Company Brain represents a fundamental evolution beyond passive, static enterprise storage systems like Confluence or SharePoint. By ingesting active meeting memos, trial dashboards, strategic board discussions, and clinical stage-gate decisions, it functions as a centralized, dynamic, and fully auditable </w:t>
       </w:r>
       <w:r>
         <w:rPr>
@@ -1306,7 +1002,15 @@
         <w:t>AI Chief of Staff</w:t>
       </w:r>
       <w:r>
-        <w:t xml:space="preserve"> that sits at the center of the organization. This system possesses a continuous, synthesized understanding of the company's real-time operational status, acting as a proactive partner in guiding executive decision-making.</w:t>
+        <w:t xml:space="preserve"> that sits at the center of the organization. Clinical directors and executives can query the Company Brain about any drug candidate, protocol, or competitive update and receive a highly synthesized response, directly cited to specific meeting memos, discussions, and trial registries.</w:t>
+      </w:r>
+    </w:p>
+    <w:p>
+      <w:pPr>
+        <w:pStyle w:val="Heading2"/>
+      </w:pPr>
+      <w:r>
+        <w:t>6. Trial Manager Assistant: Clinical ITSM and Operational Coordination</w:t>
       </w:r>
     </w:p>
     <w:p>
@@ -1314,15 +1018,15 @@
         <w:jc w:val="left"/>
       </w:pPr>
       <w:r>
-        <w:t>By establishing the LLM Wiki as the primary operational repository, the cost of keeping organizational knowledge current drops to near zero, enabling a hyper-efficient global clinical team to operate with absolute alignment and total context.</w:t>
+        <w:t>The logistics of clinical trial execution are traditionally plagued by administrative latency and communication silos. The AI-native biotech addresses this by adapting IT Service Management (ITSM) principles—specifically real-time monitoring, automated ticketing, severity-based triaging, and service level agreements (SLAs)—to clinical trial execution. Instead of managing server alerts, the system monitors clinical data streams to identify, flag, and coordinate resolution of operational trial bottlenecks.</w:t>
       </w:r>
     </w:p>
     <w:p>
       <w:pPr>
-        <w:pStyle w:val="Heading2"/>
+        <w:pStyle w:val="Heading3"/>
       </w:pPr>
       <w:r>
-        <w:t>6. Innovation Arbitrage: Global Asset Sourcing and Licensing Risks</w:t>
+        <w:t>Architecture: Clinical ITSM</w:t>
       </w:r>
     </w:p>
     <w:p>
@@ -1330,16 +1034,16 @@
         <w:jc w:val="left"/>
       </w:pPr>
       <w:r>
-        <w:t xml:space="preserve">The 10x operational productivity and cognitive augmentation described throughout this memo are not merely theoretical efficiency gains—they have immediate, high-leverage applications in global asset sourcing and licensing. Specifically, they unlock the ability to exploit the massive </w:t>
+        <w:t xml:space="preserve">The </w:t>
       </w:r>
       <w:r>
         <w:rPr>
           <w:b/>
         </w:rPr>
-        <w:t>Innovation Arbitrage</w:t>
+        <w:t>Clinical ITSM</w:t>
       </w:r>
       <w:r>
-        <w:t xml:space="preserve"> currently emerging from China.</w:t>
+        <w:t xml:space="preserve"> architecture is an automated workflow loop where background agents parse clinical databases (EDC, CTMS, EHR, and supply chain) in real time to triage operational anomalies, route tasks to human owners, and execute automated compliance nudges.</w:t>
       </w:r>
     </w:p>
     <w:p>
@@ -1347,67 +1051,7 @@
         <w:jc w:val="left"/>
       </w:pPr>
       <w:r>
-        <w:t xml:space="preserve">In 2025, a fundamental transformation occurred in the global pharmaceutical market: Chinese biotechs underwent a dramatic shift from licensing Western drugs in to licensing Chinese-origin drugs out. Chinese companies signed a record </w:t>
-      </w:r>
-      <w:r>
-        <w:rPr>
-          <w:b/>
-        </w:rPr>
-        <w:t>$135.7 billion</w:t>
-      </w:r>
-      <w:r>
-        <w:t xml:space="preserve"> in outbound licensing agreements—representing </w:t>
-      </w:r>
-      <w:r>
-        <w:rPr>
-          <w:b/>
-        </w:rPr>
-        <w:t>one-third of all global licensing spend</w:t>
-      </w:r>
-      <w:r>
-        <w:t>, and making China the world's most important source of licensable drug assets (https://www.axios.com/2025/09/08/china-deals-biotech-us).</w:t>
-      </w:r>
-    </w:p>
-    <w:p>
-      <w:pPr>
-        <w:jc w:val="left"/>
-      </w:pPr>
-      <w:r>
-        <w:t>For legacy pharmaceutical giants, aggressively sourcing from this massive influx of Chinese-origin clinical assets is an operational impossibility. Bloated manual processes, language barriers, complex cross-border regulations, and historical data-integrity risks limit their capacity to review and diligence more than a handful of candidate compounds per year. Conversely, a hyper-agile, AI-native biotech team—armed with a compounding Company Brain and autonomous screening agents—can continuously crawl Chinese clinical registries, ingest thousands of preclinical profiles, and conduct rigorous, automated due diligence at scale. This allows a three-person operational team to evaluate hundreds of assets, identify high-potential candidates, and execute cross-border licensing deals with 10x greater agility, speed, and strategic precision than a traditional biopharma conglomerate.</w:t>
-      </w:r>
-    </w:p>
-    <w:p>
-      <w:pPr>
-        <w:jc w:val="left"/>
-      </w:pPr>
-      <w:r>
-        <w:t xml:space="preserve">This growth is driven by a powerful "Innovation Arbitrage": Chinese drug discovery costs are </w:t>
-      </w:r>
-      <w:r>
-        <w:rPr>
-          <w:b/>
-        </w:rPr>
-        <w:t>30% to 40% lower</w:t>
-      </w:r>
-      <w:r>
-        <w:t xml:space="preserve"> than in the US/EU, while clinical trial enrollment is </w:t>
-      </w:r>
-      <w:r>
-        <w:rPr>
-          <w:b/>
-        </w:rPr>
-        <w:t>2 to 3 times faster</w:t>
-      </w:r>
-      <w:r>
-        <w:t xml:space="preserve"> due to China's massive patient population. This allows Western biotechs to access de-risked, clinical-stage assets at valuations that still represent significant upside versus internal development. (https://visionlifesciences.com/insights/china-biotech-outbound-licensing-tracker)</w:t>
-      </w:r>
-    </w:p>
-    <w:p>
-      <w:pPr>
-        <w:jc w:val="left"/>
-      </w:pPr>
-      <w:r>
-        <w:t>The landscape is defined by several landmark successes:</w:t>
+        <w:t>This operational loop executes across three core steps:</w:t>
       </w:r>
     </w:p>
     <w:p>
@@ -1418,10 +1062,10 @@
         <w:rPr>
           <w:b/>
         </w:rPr>
-        <w:t>CARVYKTI (ciltacabtagene autoleucel)</w:t>
+        <w:t>Continuous Monitoring</w:t>
       </w:r>
       <w:r>
-        <w:t>: First Chinese-origin CAR-T cell therapy to receive FDA approval, licensed to Johnson &amp; Johnson and generating $1+ billion in revenue.</w:t>
+        <w:t>: Autonomous agents act as background observers, parsing daily site enrollment speeds, data entry delays in the Electronic Data Capture (EDC) system, protocol deviations, and clinical inventory thresholds.</w:t>
       </w:r>
     </w:p>
     <w:p>
@@ -1432,10 +1076,10 @@
         <w:rPr>
           <w:b/>
         </w:rPr>
-        <w:t>Tislelizumab</w:t>
+        <w:t>Automated Triage and Routing</w:t>
       </w:r>
       <w:r>
-        <w:t>: A Chinese-origin PD-1 inhibitor developed by BeiGene, licensed to Novartis in a landmark $2.2 billion deal and receiving FDA approval in 2023.</w:t>
+        <w:t>: When an anomaly is detected (e.g., a site's data entry backlog exceeds 48 hours, or a cold-chain shipment temperature deviates), the agent automatically logs the incident, determines its severity (ranging from P4 operational alerts up to P1 clinical emergencies, such as a Serious Adverse Event), and routes it to the appropriate human owner with a suggested GxP-compliant resolution. For P1 safety-critical alerts, the system initiates a hardcoded, redundant escalation loop across multiple channels (SMS, email, and CTMS dashboard alerts). If a human operator does not acknowledge the safety signal within a strict SLA window, the system automatically escalates the alert to the Chief Medical Officer. Because ignoring an adverse event has catastrophic regulatory and clinical implications, this escalation logic is hardcoded and cannot be modified or bypassed by the agent.</w:t>
       </w:r>
     </w:p>
     <w:p>
@@ -1446,24 +1090,10 @@
         <w:rPr>
           <w:b/>
         </w:rPr>
-        <w:t>Ivonescimab (AK112)</w:t>
+        <w:t>Autonomous Interaction</w:t>
       </w:r>
       <w:r>
-        <w:t>: A PD-1/VEGF bispecific antibody developed by Akeso, licensed to Summit Therapeutics in a $5.0 billion deal, demonstrating superior Phase 3 efficacy versus Keytruda.</w:t>
-      </w:r>
-    </w:p>
-    <w:p>
-      <w:pPr>
-        <w:pStyle w:val="ListBullet"/>
-      </w:pPr>
-      <w:r>
-        <w:rPr>
-          <w:b/>
-        </w:rPr>
-        <w:t>GSK / Hengrui Deal</w:t>
-      </w:r>
-      <w:r>
-        <w:t>: A $12.5 billion outbound licensing deal for Hengrui's HRS-9821 for COPD, reflecting premium, selective pricing. (https://visionlifesciences.com/insights/china-biotech-outbound-licensing-tracker)</w:t>
+        <w:t>: For routine compliance tasks, the agent drafts and dispatches personalized, language-localized nudges directly to clinical site coordinators, bypassing manual investigator emails and reducing "white space" latency.</w:t>
       </w:r>
     </w:p>
     <w:p>
@@ -1471,25 +1101,7 @@
         <w:jc w:val="left"/>
       </w:pPr>
       <w:r>
-        <w:t xml:space="preserve">However, sourcing assets from China introduces a severe historical risk: </w:t>
-      </w:r>
-      <w:r>
-        <w:rPr>
-          <w:b/>
-        </w:rPr>
-        <w:t>Data Integrity</w:t>
-      </w:r>
-      <w:r>
-        <w:t xml:space="preserve">. In July 2015, the Chinese FDA ordered a self-examination of clinical trial data behind 1,622 drug applications. This resulted in approximately </w:t>
-      </w:r>
-      <w:r>
-        <w:rPr>
-          <w:b/>
-        </w:rPr>
-        <w:t>80% of applications being voluntarily withdrawn</w:t>
-      </w:r>
-      <w:r>
-        <w:t xml:space="preserve"> due to serious quality issues, including data fabrication, GCP non-compliance, and incomplete data. (https://www.bmj.com/content/355/bmj.i5396) Tackle of false trial data has modernised rapidly, driven by China's 2017 ICH membership and partnerships with global CROs (IQVIA, Parexel). However, data integrity concerns remain a real risk, as highlighted by the FDA's 2025 General Correspondence Letters to two Chinese testing firms. (https://www.fda.gov/news-events/press-announcements/fda-takes-action-address-data-integrity-concerns-two-chinese-third-party-testing-firms)</w:t>
+        <w:t>The core value proposition focuses on proactive risk mitigation, data integrity, and enhanced executive leverage. Traditional clinical trials rely on periodic, manual audits (often monthly or quarterly during CRA visits), leaving critical protocol compliance gaps unaddressed for weeks. The Trial Manager Assistant establishes a real-time audit posture, ensuring that GCP compliance is continuously monitored and recorded. By automating 80% of routine tracking, vendor queries, and compliance alert triaging, clinical operators can manage trial logistics with far greater precision and zero degradation in data quality.</w:t>
       </w:r>
     </w:p>
     <w:p>
@@ -1497,109 +1109,25 @@
         <w:jc w:val="left"/>
       </w:pPr>
       <w:r>
-        <w:t>To navigate this landscape, the AI-native biotech must avoid five critical contractual traps identified by Morgan Lewis (April 2026):</w:t>
-      </w:r>
-    </w:p>
-    <w:p>
-      <w:pPr>
-        <w:jc w:val="left"/>
-      </w:pPr>
-      <w:r>
-        <w:t xml:space="preserve">1. </w:t>
+        <w:t xml:space="preserve">Deploying these systems introduces risks of sociotechnical friction, as highlighted in the </w:t>
       </w:r>
       <w:r>
         <w:rPr>
           <w:b/>
         </w:rPr>
-        <w:t>Toothless Anti-Shelving Clauses</w:t>
+        <w:t>JMIR AI 2026 Framework</w:t>
       </w:r>
       <w:r>
-        <w:t>: MNCs prioritizing competing internal pipelines, leaving the licensed asset shelved. Innovators must demand specific, measurable development milestones and hard deadlines rather than relying on vague Commercially Reasonable Efforts (CRE) clauses. (https://www.morganlewis.com/pubs/2026/04/a-strategic-playbook-for-chinese-biotech-cross-border-deals-navigating-the-new-value-paradigm)</w:t>
-      </w:r>
-    </w:p>
-    <w:p>
-      <w:pPr>
-        <w:jc w:val="left"/>
-      </w:pPr>
-      <w:r>
-        <w:t xml:space="preserve">2. </w:t>
+        <w:t xml:space="preserve">. If agents contact clinical sites too frequently or with incorrect contexts, they risk causing investigator fatigue and clinical site alienation. Furthermore, because a regulated clinical trial cannot afford any non-deterministic behavior, the system enforces a strict guardrail: </w:t>
       </w:r>
       <w:r>
         <w:rPr>
           <w:b/>
         </w:rPr>
-        <w:t>Change-of-Control Vulnerabilities</w:t>
+        <w:t>humans-in-the-loop</w:t>
       </w:r>
       <w:r>
-        <w:t>: The licensee being acquired by a competitor of the Chinese innovator, jeopardizing the asset's future. Contracts must explicitly dictate how licenses and data rights are handled in the event of an acquisition.</w:t>
-      </w:r>
-    </w:p>
-    <w:p>
-      <w:pPr>
-        <w:jc w:val="left"/>
-      </w:pPr>
-      <w:r>
-        <w:t xml:space="preserve">3. </w:t>
-      </w:r>
-      <w:r>
-        <w:rPr>
-          <w:b/>
-        </w:rPr>
-        <w:t>Disappearing Milestones</w:t>
-      </w:r>
-      <w:r>
-        <w:t>: Post-closing restructuring of clinical plans by the licensee to bypass milestone payment triggers. Precise definitions of triggering events are essential in the contract.</w:t>
-      </w:r>
-    </w:p>
-    <w:p>
-      <w:pPr>
-        <w:jc w:val="left"/>
-      </w:pPr>
-      <w:r>
-        <w:t xml:space="preserve">4. </w:t>
-      </w:r>
-      <w:r>
-        <w:rPr>
-          <w:b/>
-        </w:rPr>
-        <w:t>Ambiguous Data Rights</w:t>
-      </w:r>
-      <w:r>
-        <w:t>: Clashes over the ownership and use of global clinical data to support domestic regulatory filings. Innovators must ensure they retain sufficient rights to leverage global trial data to support domestic regulatory filings in their home markets.</w:t>
-      </w:r>
-    </w:p>
-    <w:p>
-      <w:pPr>
-        <w:jc w:val="left"/>
-      </w:pPr>
-      <w:r>
-        <w:t xml:space="preserve">5. </w:t>
-      </w:r>
-      <w:r>
-        <w:rPr>
-          <w:b/>
-        </w:rPr>
-        <w:t>Data Integrity and Compliance</w:t>
-      </w:r>
-      <w:r>
-        <w:t>: Inability of Chinese clinical data to meet rigorous FDA/EMA standards, triggering regulatory delays. MNCs demand rigorous validation that Chinese clinical data meets FDA/EMA standards, requiring absolute compliance with China's cross-border data transfer regulations and clear ownership of AI training data.</w:t>
-      </w:r>
-    </w:p>
-    <w:p>
-      <w:pPr>
-        <w:jc w:val="left"/>
-      </w:pPr>
-      <w:r>
-        <w:t xml:space="preserve">To optimize focus and speed, sophisticated developers increasingly utilize the </w:t>
-      </w:r>
-      <w:r>
-        <w:rPr>
-          <w:b/>
-        </w:rPr>
-        <w:t>NewCo Licensing Model</w:t>
-      </w:r>
-      <w:r>
-        <w:t>, partnering with VC-backed NewCos (e.g., Hengrui's $1.1B deal with Braveheart Bio for cardiomyopathy drug HRS-1893) to capture higher economics, faster decision-making, and a built-to-buy endgame. (https://visionlifesciences.com/insights/china-biotech-outbound-licensing-tracker)</w:t>
+        <w:t>. The agent operates as an advisor and draft-generator for external-facing communication, and all external interactions, protocol changes, and critical clinical decisions require explicit human authorization before execution. This ensures full alignment with regulatory expectations for clinical data oversight.</w:t>
       </w:r>
     </w:p>
     <w:p>
@@ -1624,15 +1152,7 @@
         <w:t>AI-native biotech</w:t>
       </w:r>
       <w:r>
-        <w:t xml:space="preserve"> represents the natural next frontier for the global AI agent disruption. The true competitive advantage of the AI-native model lies in execution quality, strategic velocity, and risk mitigation. By re-engineering the entire corporate operating biology, a hyper-lean organization can make high-quality clinical decisions faster, identify and diligence high-value clinical assets in minutes, and execute cross-border licensing deals with unprecedented agility. Most importantly, this systematic precision directly targets and eliminates the operational and strategic missteps that currently account for 30% to 50% of drug candidate attrition in traditional, bloated biopharma organizations.</w:t>
-      </w:r>
-    </w:p>
-    <w:p>
-      <w:pPr>
-        <w:jc w:val="left"/>
-      </w:pPr>
-      <w:r>
-        <w:t>Operating with just 10% of the tier-1 human labor footprint of traditional biopharma, the AI-native biotech is positioned to run circles around slow-moving legacy conglomerates in the midst of the Chinese asset outbound boom. This paradigm shift represents a once-in-a-lifetime opportunity to build a generational $100 billion to $1 trillion company, commanding an automated swarm of goal-directed AI agents to achieve compounding operational leverage and redefine the future of global therapeutic development.</w:t>
+        <w:t xml:space="preserve"> represents the next frontier of therapeutic development—shifting the focus from early-stage target prediction to the agentic execution of clinical trials. By pairing elite clinical leadership with a universally adopted, compliance-first suite of autonomous agents, we establish unprecedented operational leverage and safety. This model enables us to run circles around administrative-heavy legacy organizations, execute cross-border diligence with 10x agility, and systematically mitigate clinical trial risks. This paradigm shift represents a once-in-a-lifetime opportunity to leverage compounding corporate intelligence and build a generational, $100 billion to $1 trillion therapeutic development company.</w:t>
       </w:r>
     </w:p>
     <w:sectPr>

</xml_diff>